<commit_message>
Didn't finish lab21 just yet
</commit_message>
<xml_diff>
--- a/sem-4/Lr21.docx
+++ b/sem-4/Lr21.docx
@@ -286,13 +286,23 @@
           <w:szCs w:val="28"/>
         </w:rPr>
       </w:pPr>
-      <w:r>
-        <w:rPr>
-          <w:rFonts w:ascii="Times New Roman" w:hAnsi="Times New Roman" w:cs="Times New Roman"/>
-          <w:sz w:val="28"/>
-          <w:szCs w:val="28"/>
-        </w:rPr>
-        <w:t>Бинеман Никита Александрович</w:t>
+      <w:proofErr w:type="spellStart"/>
+      <w:r>
+        <w:rPr>
+          <w:rFonts w:ascii="Times New Roman" w:hAnsi="Times New Roman" w:cs="Times New Roman"/>
+          <w:sz w:val="28"/>
+          <w:szCs w:val="28"/>
+        </w:rPr>
+        <w:t>Бинеман</w:t>
+      </w:r>
+      <w:proofErr w:type="spellEnd"/>
+      <w:r>
+        <w:rPr>
+          <w:rFonts w:ascii="Times New Roman" w:hAnsi="Times New Roman" w:cs="Times New Roman"/>
+          <w:sz w:val="28"/>
+          <w:szCs w:val="28"/>
+        </w:rPr>
+        <w:t xml:space="preserve"> Никита Александрович</w:t>
       </w:r>
     </w:p>
     <w:p>
@@ -1166,6 +1176,7 @@
         </w:rPr>
         <w:t xml:space="preserve">1 </w:t>
       </w:r>
+      <w:proofErr w:type="spellStart"/>
       <w:r>
         <w:rPr>
           <w:rFonts w:ascii="Times New Roman" w:eastAsia="Times New Roman" w:hAnsi="Times New Roman" w:cs="Times New Roman"/>
@@ -1190,6 +1201,7 @@
         </w:rPr>
         <w:t>А</w:t>
       </w:r>
+      <w:proofErr w:type="spellEnd"/>
       <w:r>
         <w:rPr>
           <w:rFonts w:ascii="Times New Roman" w:eastAsia="Times New Roman" w:hAnsi="Times New Roman" w:cs="Times New Roman"/>
@@ -1237,6 +1249,7 @@
         </w:rPr>
         <w:t>D4 27</w:t>
       </w:r>
+      <w:proofErr w:type="gramStart"/>
       <w:r>
         <w:rPr>
           <w:rFonts w:ascii="Times New Roman" w:eastAsia="Times New Roman" w:hAnsi="Times New Roman" w:cs="Times New Roman"/>
@@ -1253,7 +1266,16 @@
           <w:sz w:val="28"/>
           <w:szCs w:val="28"/>
         </w:rPr>
-        <w:t xml:space="preserve"> 100В</w:t>
+        <w:t xml:space="preserve"> 100</w:t>
+      </w:r>
+      <w:proofErr w:type="gramEnd"/>
+      <w:r>
+        <w:rPr>
+          <w:rFonts w:ascii="Times New Roman" w:eastAsia="Times New Roman" w:hAnsi="Times New Roman" w:cs="Times New Roman"/>
+          <w:sz w:val="28"/>
+          <w:szCs w:val="28"/>
+        </w:rPr>
+        <w:t>В</w:t>
       </w:r>
     </w:p>
     <w:p>
@@ -2402,6 +2424,7 @@
         </w:rPr>
         <w:t xml:space="preserve">8 </w:t>
       </w:r>
+      <w:proofErr w:type="spellStart"/>
       <w:r>
         <w:rPr>
           <w:rFonts w:ascii="Times New Roman" w:eastAsia="Times New Roman" w:hAnsi="Times New Roman" w:cs="Times New Roman"/>
@@ -2411,6 +2434,7 @@
         </w:rPr>
         <w:t>init</w:t>
       </w:r>
+      <w:proofErr w:type="spellEnd"/>
       <w:r>
         <w:rPr>
           <w:rFonts w:ascii="Times New Roman" w:eastAsia="Times New Roman" w:hAnsi="Times New Roman" w:cs="Times New Roman"/>
@@ -3013,6 +3037,7 @@
       <w:r>
         <w:rPr>
           <w:rFonts w:ascii="Times New Roman" w:hAnsi="Times New Roman" w:cs="Times New Roman"/>
+          <w:noProof/>
           <w:sz w:val="28"/>
           <w:szCs w:val="28"/>
         </w:rPr>
@@ -3180,6 +3205,7 @@
               </w:rPr>
               <w:t>U</w:t>
             </w:r>
+            <w:proofErr w:type="spellStart"/>
             <w:r>
               <w:rPr>
                 <w:rFonts w:ascii="Times New Roman" w:hAnsi="Times New Roman" w:cs="Times New Roman"/>
@@ -3189,6 +3215,7 @@
               </w:rPr>
               <w:t>обр</w:t>
             </w:r>
+            <w:proofErr w:type="spellEnd"/>
             <w:r>
               <w:rPr>
                 <w:rFonts w:ascii="Times New Roman" w:hAnsi="Times New Roman" w:cs="Times New Roman"/>
@@ -3222,6 +3249,7 @@
               </w:rPr>
               <w:t>I</w:t>
             </w:r>
+            <w:proofErr w:type="spellStart"/>
             <w:r>
               <w:rPr>
                 <w:rFonts w:ascii="Times New Roman" w:hAnsi="Times New Roman" w:cs="Times New Roman"/>
@@ -3231,6 +3259,7 @@
               </w:rPr>
               <w:t>обр</w:t>
             </w:r>
+            <w:proofErr w:type="spellEnd"/>
             <w:r>
               <w:rPr>
                 <w:rFonts w:ascii="Times New Roman" w:hAnsi="Times New Roman" w:cs="Times New Roman"/>
@@ -3307,6 +3336,7 @@
               </w:rPr>
               <w:t>U</w:t>
             </w:r>
+            <w:proofErr w:type="spellStart"/>
             <w:r>
               <w:rPr>
                 <w:rFonts w:ascii="Times New Roman" w:hAnsi="Times New Roman" w:cs="Times New Roman"/>
@@ -3316,6 +3346,7 @@
               </w:rPr>
               <w:t>пр</w:t>
             </w:r>
+            <w:proofErr w:type="spellEnd"/>
             <w:r>
               <w:rPr>
                 <w:rFonts w:ascii="Times New Roman" w:hAnsi="Times New Roman" w:cs="Times New Roman"/>
@@ -3349,6 +3380,7 @@
               </w:rPr>
               <w:t>I</w:t>
             </w:r>
+            <w:proofErr w:type="spellStart"/>
             <w:r>
               <w:rPr>
                 <w:rFonts w:ascii="Times New Roman" w:hAnsi="Times New Roman" w:cs="Times New Roman"/>
@@ -3358,6 +3390,7 @@
               </w:rPr>
               <w:t>пр</w:t>
             </w:r>
+            <w:proofErr w:type="spellEnd"/>
             <w:r>
               <w:rPr>
                 <w:rFonts w:ascii="Times New Roman" w:hAnsi="Times New Roman" w:cs="Times New Roman"/>
@@ -3373,6 +3406,7 @@
         <w:tc>
           <w:tcPr>
             <w:tcW w:w="1534" w:type="dxa"/>
+            <w:vMerge w:val="restart"/>
           </w:tcPr>
           <w:p>
             <w:pPr>
@@ -3401,6 +3435,41 @@
                 <w:lang w:val="en-US"/>
               </w:rPr>
               <w:t>9</w:t>
+            </w:r>
+          </w:p>
+        </w:tc>
+        <w:tc>
+          <w:tcPr>
+            <w:tcW w:w="1534" w:type="dxa"/>
+            <w:vMerge w:val="restart"/>
+          </w:tcPr>
+          <w:p>
+            <w:pPr>
+              <w:pStyle w:val="ListParagraph"/>
+              <w:ind w:left="0"/>
+              <w:rPr>
+                <w:rFonts w:ascii="Times New Roman" w:hAnsi="Times New Roman" w:cs="Times New Roman"/>
+                <w:sz w:val="28"/>
+                <w:szCs w:val="28"/>
+                <w:lang w:val="en-US"/>
+              </w:rPr>
+            </w:pPr>
+            <w:r>
+              <w:rPr>
+                <w:rFonts w:ascii="Times New Roman" w:hAnsi="Times New Roman" w:cs="Times New Roman"/>
+                <w:sz w:val="28"/>
+                <w:szCs w:val="28"/>
+                <w:lang w:val="en-US"/>
+              </w:rPr>
+              <w:t>1</w:t>
+            </w:r>
+            <w:r>
+              <w:rPr>
+                <w:rFonts w:ascii="Times New Roman" w:hAnsi="Times New Roman" w:cs="Times New Roman"/>
+                <w:sz w:val="28"/>
+                <w:szCs w:val="28"/>
+              </w:rPr>
+              <w:t>19</w:t>
             </w:r>
           </w:p>
         </w:tc>
@@ -3426,7 +3495,7 @@
                 <w:szCs w:val="28"/>
                 <w:lang w:val="en-US"/>
               </w:rPr>
-              <w:t>1</w:t>
+              <w:t>11</w:t>
             </w:r>
             <w:r>
               <w:rPr>
@@ -3434,39 +3503,16 @@
                 <w:sz w:val="28"/>
                 <w:szCs w:val="28"/>
               </w:rPr>
-              <w:t>1</w:t>
+              <w:t>.</w:t>
             </w:r>
             <w:r>
               <w:rPr>
                 <w:rFonts w:ascii="Times New Roman" w:hAnsi="Times New Roman" w:cs="Times New Roman"/>
                 <w:sz w:val="28"/>
                 <w:szCs w:val="28"/>
+                <w:lang w:val="en-US"/>
               </w:rPr>
               <w:t>9</w:t>
-            </w:r>
-          </w:p>
-        </w:tc>
-        <w:tc>
-          <w:tcPr>
-            <w:tcW w:w="1534" w:type="dxa"/>
-          </w:tcPr>
-          <w:p>
-            <w:pPr>
-              <w:pStyle w:val="ListParagraph"/>
-              <w:ind w:left="0"/>
-              <w:rPr>
-                <w:rFonts w:ascii="Times New Roman" w:hAnsi="Times New Roman" w:cs="Times New Roman"/>
-                <w:sz w:val="28"/>
-                <w:szCs w:val="28"/>
-              </w:rPr>
-            </w:pPr>
-            <w:r>
-              <w:rPr>
-                <w:rFonts w:ascii="Times New Roman" w:hAnsi="Times New Roman" w:cs="Times New Roman"/>
-                <w:sz w:val="28"/>
-                <w:szCs w:val="28"/>
-              </w:rPr>
-              <w:t>21.1</w:t>
             </w:r>
           </w:p>
         </w:tc>
@@ -3506,6 +3552,7 @@
                 <w:rFonts w:ascii="Times New Roman" w:hAnsi="Times New Roman" w:cs="Times New Roman"/>
                 <w:sz w:val="28"/>
                 <w:szCs w:val="28"/>
+                <w:lang w:val="en-US"/>
               </w:rPr>
             </w:pPr>
             <w:r>
@@ -3513,6 +3560,297 @@
                 <w:rFonts w:ascii="Times New Roman" w:hAnsi="Times New Roman" w:cs="Times New Roman"/>
                 <w:sz w:val="28"/>
                 <w:szCs w:val="28"/>
+                <w:lang w:val="en-US"/>
+              </w:rPr>
+              <w:t>0.5</w:t>
+            </w:r>
+          </w:p>
+        </w:tc>
+        <w:tc>
+          <w:tcPr>
+            <w:tcW w:w="1535" w:type="dxa"/>
+          </w:tcPr>
+          <w:p>
+            <w:pPr>
+              <w:pStyle w:val="ListParagraph"/>
+              <w:ind w:left="0"/>
+              <w:rPr>
+                <w:rFonts w:ascii="Times New Roman" w:hAnsi="Times New Roman" w:cs="Times New Roman"/>
+                <w:sz w:val="28"/>
+                <w:szCs w:val="28"/>
+              </w:rPr>
+            </w:pPr>
+            <w:r>
+              <w:rPr>
+                <w:rFonts w:ascii="Times New Roman" w:hAnsi="Times New Roman" w:cs="Times New Roman"/>
+                <w:sz w:val="28"/>
+                <w:szCs w:val="28"/>
+              </w:rPr>
+              <w:t>0.917</w:t>
+            </w:r>
+          </w:p>
+        </w:tc>
+        <w:tc>
+          <w:tcPr>
+            <w:tcW w:w="1535" w:type="dxa"/>
+          </w:tcPr>
+          <w:p>
+            <w:pPr>
+              <w:pStyle w:val="ListParagraph"/>
+              <w:ind w:left="0"/>
+              <w:rPr>
+                <w:rFonts w:ascii="Times New Roman" w:hAnsi="Times New Roman" w:cs="Times New Roman"/>
+                <w:sz w:val="28"/>
+                <w:szCs w:val="28"/>
+              </w:rPr>
+            </w:pPr>
+            <w:r>
+              <w:rPr>
+                <w:rFonts w:ascii="Times New Roman" w:hAnsi="Times New Roman" w:cs="Times New Roman"/>
+                <w:sz w:val="28"/>
+                <w:szCs w:val="28"/>
+              </w:rPr>
+              <w:t>0.041</w:t>
+            </w:r>
+          </w:p>
+        </w:tc>
+      </w:tr>
+      <w:tr>
+        <w:tc>
+          <w:tcPr>
+            <w:tcW w:w="1534" w:type="dxa"/>
+            <w:vMerge/>
+          </w:tcPr>
+          <w:p>
+            <w:pPr>
+              <w:pStyle w:val="ListParagraph"/>
+              <w:ind w:left="0"/>
+              <w:rPr>
+                <w:rFonts w:ascii="Times New Roman" w:hAnsi="Times New Roman" w:cs="Times New Roman"/>
+                <w:sz w:val="28"/>
+                <w:szCs w:val="28"/>
+              </w:rPr>
+            </w:pPr>
+          </w:p>
+        </w:tc>
+        <w:tc>
+          <w:tcPr>
+            <w:tcW w:w="1534" w:type="dxa"/>
+            <w:vMerge/>
+          </w:tcPr>
+          <w:p>
+            <w:pPr>
+              <w:pStyle w:val="ListParagraph"/>
+              <w:ind w:left="0"/>
+              <w:rPr>
+                <w:rFonts w:ascii="Times New Roman" w:hAnsi="Times New Roman" w:cs="Times New Roman"/>
+                <w:sz w:val="28"/>
+                <w:szCs w:val="28"/>
+                <w:lang w:val="en-US"/>
+              </w:rPr>
+            </w:pPr>
+          </w:p>
+        </w:tc>
+        <w:tc>
+          <w:tcPr>
+            <w:tcW w:w="1534" w:type="dxa"/>
+          </w:tcPr>
+          <w:p>
+            <w:pPr>
+              <w:pStyle w:val="ListParagraph"/>
+              <w:ind w:left="0"/>
+              <w:rPr>
+                <w:rFonts w:ascii="Times New Roman" w:hAnsi="Times New Roman" w:cs="Times New Roman"/>
+                <w:sz w:val="28"/>
+                <w:szCs w:val="28"/>
+                <w:lang w:val="en-US"/>
+              </w:rPr>
+            </w:pPr>
+            <w:r>
+              <w:rPr>
+                <w:rFonts w:ascii="Times New Roman" w:hAnsi="Times New Roman" w:cs="Times New Roman"/>
+                <w:sz w:val="28"/>
+                <w:szCs w:val="28"/>
+                <w:lang w:val="en-US"/>
+              </w:rPr>
+              <w:t>23.8</w:t>
+            </w:r>
+          </w:p>
+        </w:tc>
+        <w:tc>
+          <w:tcPr>
+            <w:tcW w:w="1535" w:type="dxa"/>
+          </w:tcPr>
+          <w:p>
+            <w:pPr>
+              <w:pStyle w:val="ListParagraph"/>
+              <w:ind w:left="0"/>
+              <w:rPr>
+                <w:rFonts w:ascii="Times New Roman" w:hAnsi="Times New Roman" w:cs="Times New Roman"/>
+                <w:sz w:val="28"/>
+                <w:szCs w:val="28"/>
+              </w:rPr>
+            </w:pPr>
+          </w:p>
+        </w:tc>
+        <w:tc>
+          <w:tcPr>
+            <w:tcW w:w="1535" w:type="dxa"/>
+          </w:tcPr>
+          <w:p>
+            <w:pPr>
+              <w:pStyle w:val="ListParagraph"/>
+              <w:ind w:left="0"/>
+              <w:rPr>
+                <w:rFonts w:ascii="Times New Roman" w:hAnsi="Times New Roman" w:cs="Times New Roman"/>
+                <w:sz w:val="28"/>
+                <w:szCs w:val="28"/>
+                <w:lang w:val="en-US"/>
+              </w:rPr>
+            </w:pPr>
+            <w:r>
+              <w:rPr>
+                <w:rFonts w:ascii="Times New Roman" w:hAnsi="Times New Roman" w:cs="Times New Roman"/>
+                <w:sz w:val="28"/>
+                <w:szCs w:val="28"/>
+                <w:lang w:val="en-US"/>
+              </w:rPr>
+              <w:t>0.75</w:t>
+            </w:r>
+          </w:p>
+        </w:tc>
+        <w:tc>
+          <w:tcPr>
+            <w:tcW w:w="1535" w:type="dxa"/>
+          </w:tcPr>
+          <w:p>
+            <w:pPr>
+              <w:pStyle w:val="ListParagraph"/>
+              <w:ind w:left="0"/>
+              <w:rPr>
+                <w:rFonts w:ascii="Times New Roman" w:hAnsi="Times New Roman" w:cs="Times New Roman"/>
+                <w:sz w:val="28"/>
+                <w:szCs w:val="28"/>
+              </w:rPr>
+            </w:pPr>
+          </w:p>
+        </w:tc>
+        <w:tc>
+          <w:tcPr>
+            <w:tcW w:w="1535" w:type="dxa"/>
+          </w:tcPr>
+          <w:p>
+            <w:pPr>
+              <w:pStyle w:val="ListParagraph"/>
+              <w:ind w:left="0"/>
+              <w:rPr>
+                <w:rFonts w:ascii="Times New Roman" w:hAnsi="Times New Roman" w:cs="Times New Roman"/>
+                <w:sz w:val="28"/>
+                <w:szCs w:val="28"/>
+              </w:rPr>
+            </w:pPr>
+          </w:p>
+        </w:tc>
+      </w:tr>
+      <w:tr>
+        <w:tc>
+          <w:tcPr>
+            <w:tcW w:w="1534" w:type="dxa"/>
+            <w:vMerge/>
+          </w:tcPr>
+          <w:p>
+            <w:pPr>
+              <w:pStyle w:val="ListParagraph"/>
+              <w:ind w:left="0"/>
+              <w:rPr>
+                <w:rFonts w:ascii="Times New Roman" w:hAnsi="Times New Roman" w:cs="Times New Roman"/>
+                <w:sz w:val="28"/>
+                <w:szCs w:val="28"/>
+              </w:rPr>
+            </w:pPr>
+          </w:p>
+        </w:tc>
+        <w:tc>
+          <w:tcPr>
+            <w:tcW w:w="1534" w:type="dxa"/>
+            <w:vMerge/>
+          </w:tcPr>
+          <w:p>
+            <w:pPr>
+              <w:pStyle w:val="ListParagraph"/>
+              <w:ind w:left="0"/>
+              <w:rPr>
+                <w:rFonts w:ascii="Times New Roman" w:hAnsi="Times New Roman" w:cs="Times New Roman"/>
+                <w:sz w:val="28"/>
+                <w:szCs w:val="28"/>
+                <w:lang w:val="en-US"/>
+              </w:rPr>
+            </w:pPr>
+          </w:p>
+        </w:tc>
+        <w:tc>
+          <w:tcPr>
+            <w:tcW w:w="1534" w:type="dxa"/>
+          </w:tcPr>
+          <w:p>
+            <w:pPr>
+              <w:pStyle w:val="ListParagraph"/>
+              <w:ind w:left="0"/>
+              <w:rPr>
+                <w:rFonts w:ascii="Times New Roman" w:hAnsi="Times New Roman" w:cs="Times New Roman"/>
+                <w:sz w:val="28"/>
+                <w:szCs w:val="28"/>
+                <w:lang w:val="en-US"/>
+              </w:rPr>
+            </w:pPr>
+            <w:r>
+              <w:rPr>
+                <w:rFonts w:ascii="Times New Roman" w:hAnsi="Times New Roman" w:cs="Times New Roman"/>
+                <w:sz w:val="28"/>
+                <w:szCs w:val="28"/>
+                <w:lang w:val="en-US"/>
+              </w:rPr>
+              <w:t>35.7</w:t>
+            </w:r>
+          </w:p>
+        </w:tc>
+        <w:tc>
+          <w:tcPr>
+            <w:tcW w:w="1535" w:type="dxa"/>
+          </w:tcPr>
+          <w:p>
+            <w:pPr>
+              <w:pStyle w:val="ListParagraph"/>
+              <w:ind w:left="0"/>
+              <w:rPr>
+                <w:rFonts w:ascii="Times New Roman" w:hAnsi="Times New Roman" w:cs="Times New Roman"/>
+                <w:sz w:val="28"/>
+                <w:szCs w:val="28"/>
+              </w:rPr>
+            </w:pPr>
+          </w:p>
+        </w:tc>
+        <w:tc>
+          <w:tcPr>
+            <w:tcW w:w="1535" w:type="dxa"/>
+          </w:tcPr>
+          <w:p>
+            <w:pPr>
+              <w:pStyle w:val="ListParagraph"/>
+              <w:ind w:left="0"/>
+              <w:rPr>
+                <w:rFonts w:ascii="Times New Roman" w:hAnsi="Times New Roman" w:cs="Times New Roman"/>
+                <w:sz w:val="28"/>
+                <w:szCs w:val="28"/>
+                <w:lang w:val="en-US"/>
+              </w:rPr>
+            </w:pPr>
+            <w:r>
+              <w:rPr>
+                <w:rFonts w:ascii="Times New Roman" w:hAnsi="Times New Roman" w:cs="Times New Roman"/>
+                <w:sz w:val="28"/>
+                <w:szCs w:val="28"/>
+                <w:lang w:val="en-US"/>
               </w:rPr>
               <w:t>1</w:t>
             </w:r>
@@ -3532,14 +3870,6 @@
                 <w:szCs w:val="28"/>
               </w:rPr>
             </w:pPr>
-            <w:r>
-              <w:rPr>
-                <w:rFonts w:ascii="Times New Roman" w:hAnsi="Times New Roman" w:cs="Times New Roman"/>
-                <w:sz w:val="28"/>
-                <w:szCs w:val="28"/>
-              </w:rPr>
-              <w:t>0.917</w:t>
-            </w:r>
           </w:p>
         </w:tc>
         <w:tc>
@@ -3556,14 +3886,6 @@
                 <w:szCs w:val="28"/>
               </w:rPr>
             </w:pPr>
-            <w:r>
-              <w:rPr>
-                <w:rFonts w:ascii="Times New Roman" w:hAnsi="Times New Roman" w:cs="Times New Roman"/>
-                <w:sz w:val="28"/>
-                <w:szCs w:val="28"/>
-              </w:rPr>
-              <w:t>0.041</w:t>
-            </w:r>
           </w:p>
         </w:tc>
       </w:tr>

</xml_diff>

<commit_message>
Still didn't finish lab21
</commit_message>
<xml_diff>
--- a/sem-4/Lr21.docx
+++ b/sem-4/Lr21.docx
@@ -3528,6 +3528,7 @@
                 <w:rFonts w:ascii="Times New Roman" w:hAnsi="Times New Roman" w:cs="Times New Roman"/>
                 <w:sz w:val="28"/>
                 <w:szCs w:val="28"/>
+                <w:lang w:val="en-US"/>
               </w:rPr>
             </w:pPr>
             <w:r>
@@ -3535,8 +3536,9 @@
                 <w:rFonts w:ascii="Times New Roman" w:hAnsi="Times New Roman" w:cs="Times New Roman"/>
                 <w:sz w:val="28"/>
                 <w:szCs w:val="28"/>
-              </w:rPr>
-              <w:t>-4.099</w:t>
+                <w:lang w:val="en-US"/>
+              </w:rPr>
+              <w:t>-1.19u</w:t>
             </w:r>
           </w:p>
         </w:tc>
@@ -3578,6 +3580,7 @@
                 <w:rFonts w:ascii="Times New Roman" w:hAnsi="Times New Roman" w:cs="Times New Roman"/>
                 <w:sz w:val="28"/>
                 <w:szCs w:val="28"/>
+                <w:lang w:val="en-US"/>
               </w:rPr>
             </w:pPr>
             <w:r>
@@ -3585,8 +3588,9 @@
                 <w:rFonts w:ascii="Times New Roman" w:hAnsi="Times New Roman" w:cs="Times New Roman"/>
                 <w:sz w:val="28"/>
                 <w:szCs w:val="28"/>
-              </w:rPr>
-              <w:t>0.917</w:t>
+                <w:lang w:val="en-US"/>
+              </w:rPr>
+              <w:t>0.5</w:t>
             </w:r>
           </w:p>
         </w:tc>
@@ -3609,8 +3613,9 @@
                 <w:rFonts w:ascii="Times New Roman" w:hAnsi="Times New Roman" w:cs="Times New Roman"/>
                 <w:sz w:val="28"/>
                 <w:szCs w:val="28"/>
-              </w:rPr>
-              <w:t>0.041</w:t>
+                <w:lang w:val="en-US"/>
+              </w:rPr>
+              <w:t>2.536u</w:t>
             </w:r>
           </w:p>
         </w:tc>
@@ -3689,8 +3694,18 @@
                 <w:rFonts w:ascii="Times New Roman" w:hAnsi="Times New Roman" w:cs="Times New Roman"/>
                 <w:sz w:val="28"/>
                 <w:szCs w:val="28"/>
+                <w:lang w:val="en-US"/>
               </w:rPr>
             </w:pPr>
+            <w:r>
+              <w:rPr>
+                <w:rFonts w:ascii="Times New Roman" w:hAnsi="Times New Roman" w:cs="Times New Roman"/>
+                <w:sz w:val="28"/>
+                <w:szCs w:val="28"/>
+                <w:lang w:val="en-US"/>
+              </w:rPr>
+              <w:t>-2.38u</w:t>
+            </w:r>
           </w:p>
         </w:tc>
         <w:tc>
@@ -3731,8 +3746,18 @@
                 <w:rFonts w:ascii="Times New Roman" w:hAnsi="Times New Roman" w:cs="Times New Roman"/>
                 <w:sz w:val="28"/>
                 <w:szCs w:val="28"/>
+                <w:lang w:val="en-US"/>
               </w:rPr>
             </w:pPr>
+            <w:r>
+              <w:rPr>
+                <w:rFonts w:ascii="Times New Roman" w:hAnsi="Times New Roman" w:cs="Times New Roman"/>
+                <w:sz w:val="28"/>
+                <w:szCs w:val="28"/>
+                <w:lang w:val="en-US"/>
+              </w:rPr>
+              <w:t>0.735</w:t>
+            </w:r>
           </w:p>
         </w:tc>
         <w:tc>
@@ -3747,8 +3772,18 @@
                 <w:rFonts w:ascii="Times New Roman" w:hAnsi="Times New Roman" w:cs="Times New Roman"/>
                 <w:sz w:val="28"/>
                 <w:szCs w:val="28"/>
+                <w:lang w:val="en-US"/>
               </w:rPr>
             </w:pPr>
+            <w:r>
+              <w:rPr>
+                <w:rFonts w:ascii="Times New Roman" w:hAnsi="Times New Roman" w:cs="Times New Roman"/>
+                <w:sz w:val="28"/>
+                <w:szCs w:val="28"/>
+                <w:lang w:val="en-US"/>
+              </w:rPr>
+              <w:t>7.267m</w:t>
+            </w:r>
           </w:p>
         </w:tc>
       </w:tr>
@@ -3826,8 +3861,18 @@
                 <w:rFonts w:ascii="Times New Roman" w:hAnsi="Times New Roman" w:cs="Times New Roman"/>
                 <w:sz w:val="28"/>
                 <w:szCs w:val="28"/>
+                <w:lang w:val="en-US"/>
               </w:rPr>
             </w:pPr>
+            <w:r>
+              <w:rPr>
+                <w:rFonts w:ascii="Times New Roman" w:hAnsi="Times New Roman" w:cs="Times New Roman"/>
+                <w:sz w:val="28"/>
+                <w:szCs w:val="28"/>
+                <w:lang w:val="en-US"/>
+              </w:rPr>
+              <w:t>-3.57u</w:t>
+            </w:r>
           </w:p>
         </w:tc>
         <w:tc>
@@ -3868,8 +3913,18 @@
                 <w:rFonts w:ascii="Times New Roman" w:hAnsi="Times New Roman" w:cs="Times New Roman"/>
                 <w:sz w:val="28"/>
                 <w:szCs w:val="28"/>
+                <w:lang w:val="en-US"/>
               </w:rPr>
             </w:pPr>
+            <w:r>
+              <w:rPr>
+                <w:rFonts w:ascii="Times New Roman" w:hAnsi="Times New Roman" w:cs="Times New Roman"/>
+                <w:sz w:val="28"/>
+                <w:szCs w:val="28"/>
+                <w:lang w:val="en-US"/>
+              </w:rPr>
+              <w:t>0.917</w:t>
+            </w:r>
           </w:p>
         </w:tc>
         <w:tc>
@@ -3884,8 +3939,18 @@
                 <w:rFonts w:ascii="Times New Roman" w:hAnsi="Times New Roman" w:cs="Times New Roman"/>
                 <w:sz w:val="28"/>
                 <w:szCs w:val="28"/>
+                <w:lang w:val="en-US"/>
               </w:rPr>
             </w:pPr>
+            <w:r>
+              <w:rPr>
+                <w:rFonts w:ascii="Times New Roman" w:hAnsi="Times New Roman" w:cs="Times New Roman"/>
+                <w:sz w:val="28"/>
+                <w:szCs w:val="28"/>
+                <w:lang w:val="en-US"/>
+              </w:rPr>
+              <w:t>0.041</w:t>
+            </w:r>
           </w:p>
         </w:tc>
       </w:tr>
@@ -3900,28 +3965,12 @@
           <w:szCs w:val="28"/>
         </w:rPr>
       </w:pPr>
-    </w:p>
-    <w:p>
-      <w:pPr>
-        <w:pStyle w:val="ListParagraph"/>
-        <w:numPr>
-          <w:ilvl w:val="0"/>
-          <w:numId w:val="11"/>
-        </w:numPr>
-        <w:jc w:val="both"/>
-        <w:rPr>
-          <w:rFonts w:ascii="Times New Roman" w:hAnsi="Times New Roman" w:cs="Times New Roman"/>
-          <w:sz w:val="28"/>
-          <w:szCs w:val="28"/>
-        </w:rPr>
-      </w:pPr>
       <w:r>
         <w:rPr>
           <w:noProof/>
         </w:rPr>
-        <w:lastRenderedPageBreak/>
         <w:drawing>
-          <wp:inline distT="0" distB="0" distL="0" distR="0" wp14:anchorId="25234CBC" wp14:editId="56439B51">
+          <wp:inline distT="0" distB="0" distL="0" distR="0" wp14:anchorId="0C586795" wp14:editId="368A73E1">
             <wp:extent cx="2004060" cy="2607846"/>
             <wp:effectExtent l="0" t="0" r="0" b="2540"/>
             <wp:docPr id="2" name="Рисунок 2"/>
@@ -3956,18 +4005,27 @@
           </wp:inline>
         </w:drawing>
       </w:r>
+    </w:p>
+    <w:p>
+      <w:pPr>
+        <w:pStyle w:val="ListParagraph"/>
+        <w:numPr>
+          <w:ilvl w:val="0"/>
+          <w:numId w:val="11"/>
+        </w:numPr>
+        <w:jc w:val="both"/>
+        <w:rPr>
+          <w:rFonts w:ascii="Times New Roman" w:hAnsi="Times New Roman" w:cs="Times New Roman"/>
+          <w:sz w:val="28"/>
+          <w:szCs w:val="28"/>
+        </w:rPr>
+      </w:pPr>
       <w:r>
         <w:rPr>
           <w:noProof/>
           <w:lang w:eastAsia="ru-RU"/>
         </w:rPr>
-        <w:t xml:space="preserve"> </w:t>
-      </w:r>
-      <w:r>
-        <w:rPr>
-          <w:noProof/>
-          <w:lang w:eastAsia="ru-RU"/>
-        </w:rPr>
+        <w:lastRenderedPageBreak/>
         <w:drawing>
           <wp:inline distT="0" distB="0" distL="0" distR="0" wp14:anchorId="44250EA9" wp14:editId="62F862A6">
             <wp:extent cx="6912610" cy="4208145"/>
@@ -4137,17 +4195,15 @@
       </w:pPr>
       <w:r>
         <w:rPr>
-          <w:rFonts w:ascii="Times New Roman" w:hAnsi="Times New Roman" w:cs="Times New Roman"/>
           <w:noProof/>
-          <w:sz w:val="28"/>
-          <w:szCs w:val="28"/>
+          <w:lang w:eastAsia="ru-RU"/>
         </w:rPr>
         <w:lastRenderedPageBreak/>
         <w:drawing>
-          <wp:inline distT="0" distB="0" distL="0" distR="0" wp14:anchorId="45537DBF" wp14:editId="2F0BE812">
-            <wp:extent cx="5648930" cy="3604260"/>
-            <wp:effectExtent l="0" t="0" r="9525" b="0"/>
-            <wp:docPr id="4" name="Рисунок 4"/>
+          <wp:inline distT="0" distB="0" distL="0" distR="0" wp14:anchorId="29AC7CA0" wp14:editId="714D7360">
+            <wp:extent cx="6191264" cy="3928262"/>
+            <wp:effectExtent l="0" t="0" r="0" b="0"/>
+            <wp:docPr id="2066563058" name="Picture 1"/>
             <wp:cNvGraphicFramePr>
               <a:graphicFrameLocks xmlns:a="http://schemas.openxmlformats.org/drawingml/2006/main" noChangeAspect="1"/>
             </wp:cNvGraphicFramePr>
@@ -4155,7 +4211,7 @@
               <a:graphicData uri="http://schemas.openxmlformats.org/drawingml/2006/picture">
                 <pic:pic xmlns:pic="http://schemas.openxmlformats.org/drawingml/2006/picture">
                   <pic:nvPicPr>
-                    <pic:cNvPr id="0" name=""/>
+                    <pic:cNvPr id="2066563058" name=""/>
                     <pic:cNvPicPr/>
                   </pic:nvPicPr>
                   <pic:blipFill>
@@ -4167,7 +4223,7 @@
                   <pic:spPr>
                     <a:xfrm>
                       <a:off x="0" y="0"/>
-                      <a:ext cx="5651767" cy="3606070"/>
+                      <a:ext cx="6213095" cy="3942114"/>
                     </a:xfrm>
                     <a:prstGeom prst="rect">
                       <a:avLst/>
@@ -4192,10 +4248,10 @@
           <w:lang w:eastAsia="ru-RU"/>
         </w:rPr>
         <w:drawing>
-          <wp:inline distT="0" distB="0" distL="0" distR="0" wp14:anchorId="56F29CBF" wp14:editId="34743902">
-            <wp:extent cx="6030167" cy="4734586"/>
-            <wp:effectExtent l="0" t="0" r="8890" b="8890"/>
-            <wp:docPr id="1492209842" name="Picture 1"/>
+          <wp:inline distT="0" distB="0" distL="0" distR="0" wp14:anchorId="6BA01347" wp14:editId="77107B68">
+            <wp:extent cx="6144482" cy="4915586"/>
+            <wp:effectExtent l="0" t="0" r="8890" b="0"/>
+            <wp:docPr id="646273817" name="Picture 1"/>
             <wp:cNvGraphicFramePr>
               <a:graphicFrameLocks xmlns:a="http://schemas.openxmlformats.org/drawingml/2006/main" noChangeAspect="1"/>
             </wp:cNvGraphicFramePr>
@@ -4203,7 +4259,7 @@
               <a:graphicData uri="http://schemas.openxmlformats.org/drawingml/2006/picture">
                 <pic:pic xmlns:pic="http://schemas.openxmlformats.org/drawingml/2006/picture">
                   <pic:nvPicPr>
-                    <pic:cNvPr id="1492209842" name=""/>
+                    <pic:cNvPr id="646273817" name=""/>
                     <pic:cNvPicPr/>
                   </pic:nvPicPr>
                   <pic:blipFill>
@@ -4215,7 +4271,7 @@
                   <pic:spPr>
                     <a:xfrm>
                       <a:off x="0" y="0"/>
-                      <a:ext cx="6030167" cy="4734586"/>
+                      <a:ext cx="6144482" cy="4915586"/>
                     </a:xfrm>
                     <a:prstGeom prst="rect">
                       <a:avLst/>

</xml_diff>

<commit_message>
Continued working on lab22
</commit_message>
<xml_diff>
--- a/sem-4/Lr21.docx
+++ b/sem-4/Lr21.docx
@@ -1,6 +1,6 @@
 
 <file path=word/document.xml><?xml version="1.0" encoding="utf-8"?>
-<w:document xmlns:wpc="http://schemas.microsoft.com/office/word/2010/wordprocessingCanvas" xmlns:cx="http://schemas.microsoft.com/office/drawing/2014/chartex" xmlns:cx1="http://schemas.microsoft.com/office/drawing/2015/9/8/chartex" xmlns:cx2="http://schemas.microsoft.com/office/drawing/2015/10/21/chartex" xmlns:cx3="http://schemas.microsoft.com/office/drawing/2016/5/9/chartex" xmlns:cx4="http://schemas.microsoft.com/office/drawing/2016/5/10/chartex" xmlns:cx5="http://schemas.microsoft.com/office/drawing/2016/5/11/chartex" xmlns:cx6="http://schemas.microsoft.com/office/drawing/2016/5/12/chartex" xmlns:cx7="http://schemas.microsoft.com/office/drawing/2016/5/13/chartex" xmlns:cx8="http://schemas.microsoft.com/office/drawing/2016/5/14/chartex" xmlns:mc="http://schemas.openxmlformats.org/markup-compatibility/2006" xmlns:aink="http://schemas.microsoft.com/office/drawing/2016/ink" xmlns:am3d="http://schemas.microsoft.com/office/drawing/2017/model3d" xmlns:o="urn:schemas-microsoft-com:office:office" xmlns:oel="http://schemas.microsoft.com/office/2019/extlst" xmlns:r="http://schemas.openxmlformats.org/officeDocument/2006/relationships" xmlns:m="http://schemas.openxmlformats.org/officeDocument/2006/math" xmlns:v="urn:schemas-microsoft-com:vml" xmlns:wp14="http://schemas.microsoft.com/office/word/2010/wordprocessingDrawing" xmlns:wp="http://schemas.openxmlformats.org/drawingml/2006/wordprocessingDrawing" xmlns:w10="urn:schemas-microsoft-com:office:word" xmlns:w="http://schemas.openxmlformats.org/wordprocessingml/2006/main" xmlns:w14="http://schemas.microsoft.com/office/word/2010/wordml" xmlns:w15="http://schemas.microsoft.com/office/word/2012/wordml" xmlns:w16cex="http://schemas.microsoft.com/office/word/2018/wordml/cex" xmlns:w16cid="http://schemas.microsoft.com/office/word/2016/wordml/cid" xmlns:w16="http://schemas.microsoft.com/office/word/2018/wordml" xmlns:w16du="http://schemas.microsoft.com/office/word/2023/wordml/word16du" xmlns:w16sdtdh="http://schemas.microsoft.com/office/word/2020/wordml/sdtdatahash" xmlns:w16sdtfl="http://schemas.microsoft.com/office/word/2024/wordml/sdtformatlock" xmlns:w16se="http://schemas.microsoft.com/office/word/2015/wordml/symex" xmlns:wpg="http://schemas.microsoft.com/office/word/2010/wordprocessingGroup" xmlns:wpi="http://schemas.microsoft.com/office/word/2010/wordprocessingInk" xmlns:wne="http://schemas.microsoft.com/office/word/2006/wordml" xmlns:wps="http://schemas.microsoft.com/office/word/2010/wordprocessingShape" mc:Ignorable="w14 w15 w16se w16cid w16 w16cex w16sdtdh w16sdtfl w16du wp14">
+<w:document xmlns:wpc="http://schemas.microsoft.com/office/word/2010/wordprocessingCanvas" xmlns:cx="http://schemas.microsoft.com/office/drawing/2014/chartex" xmlns:cx1="http://schemas.microsoft.com/office/drawing/2015/9/8/chartex" xmlns:cx2="http://schemas.microsoft.com/office/drawing/2015/10/21/chartex" xmlns:cx3="http://schemas.microsoft.com/office/drawing/2016/5/9/chartex" xmlns:cx4="http://schemas.microsoft.com/office/drawing/2016/5/10/chartex" xmlns:cx5="http://schemas.microsoft.com/office/drawing/2016/5/11/chartex" xmlns:cx6="http://schemas.microsoft.com/office/drawing/2016/5/12/chartex" xmlns:cx7="http://schemas.microsoft.com/office/drawing/2016/5/13/chartex" xmlns:cx8="http://schemas.microsoft.com/office/drawing/2016/5/14/chartex" xmlns:mc="http://schemas.openxmlformats.org/markup-compatibility/2006" xmlns:aink="http://schemas.microsoft.com/office/drawing/2016/ink" xmlns:am3d="http://schemas.microsoft.com/office/drawing/2017/model3d" xmlns:o="urn:schemas-microsoft-com:office:office" xmlns:r="http://schemas.openxmlformats.org/officeDocument/2006/relationships" xmlns:m="http://schemas.openxmlformats.org/officeDocument/2006/math" xmlns:v="urn:schemas-microsoft-com:vml" xmlns:wp14="http://schemas.microsoft.com/office/word/2010/wordprocessingDrawing" xmlns:wp="http://schemas.openxmlformats.org/drawingml/2006/wordprocessingDrawing" xmlns:w10="urn:schemas-microsoft-com:office:word" xmlns:w="http://schemas.openxmlformats.org/wordprocessingml/2006/main" xmlns:w14="http://schemas.microsoft.com/office/word/2010/wordml" xmlns:w15="http://schemas.microsoft.com/office/word/2012/wordml" xmlns:w16cex="http://schemas.microsoft.com/office/word/2018/wordml/cex" xmlns:w16cid="http://schemas.microsoft.com/office/word/2016/wordml/cid" xmlns:w16="http://schemas.microsoft.com/office/word/2018/wordml" xmlns:w16sdtdh="http://schemas.microsoft.com/office/word/2020/wordml/sdtdatahash" xmlns:w16se="http://schemas.microsoft.com/office/word/2015/wordml/symex" xmlns:wpg="http://schemas.microsoft.com/office/word/2010/wordprocessingGroup" xmlns:wpi="http://schemas.microsoft.com/office/word/2010/wordprocessingInk" xmlns:wne="http://schemas.microsoft.com/office/word/2006/wordml" xmlns:wps="http://schemas.microsoft.com/office/word/2010/wordprocessingShape" mc:Ignorable="w14 w15 w16se w16cid w16 w16cex w16sdtdh wp14">
   <w:body>
     <w:p>
       <w:pPr>
@@ -458,7 +458,7 @@
     </w:p>
     <w:p>
       <w:pPr>
-        <w:pStyle w:val="ListParagraph"/>
+        <w:pStyle w:val="a3"/>
         <w:numPr>
           <w:ilvl w:val="0"/>
           <w:numId w:val="9"/>
@@ -519,7 +519,7 @@
     </w:p>
     <w:p>
       <w:pPr>
-        <w:pStyle w:val="ListParagraph"/>
+        <w:pStyle w:val="a3"/>
         <w:numPr>
           <w:ilvl w:val="0"/>
           <w:numId w:val="9"/>
@@ -580,7 +580,7 @@
     </w:p>
     <w:p>
       <w:pPr>
-        <w:pStyle w:val="ListParagraph"/>
+        <w:pStyle w:val="a3"/>
         <w:numPr>
           <w:ilvl w:val="0"/>
           <w:numId w:val="7"/>
@@ -601,7 +601,7 @@
     </w:p>
     <w:p>
       <w:pPr>
-        <w:pStyle w:val="ListParagraph"/>
+        <w:pStyle w:val="a3"/>
         <w:numPr>
           <w:ilvl w:val="0"/>
           <w:numId w:val="13"/>
@@ -653,7 +653,7 @@
     </w:p>
     <w:p>
       <w:pPr>
-        <w:pStyle w:val="ListParagraph"/>
+        <w:pStyle w:val="a3"/>
         <w:numPr>
           <w:ilvl w:val="0"/>
           <w:numId w:val="13"/>
@@ -697,7 +697,7 @@
     </w:p>
     <w:p>
       <w:pPr>
-        <w:pStyle w:val="ListParagraph"/>
+        <w:pStyle w:val="a3"/>
         <w:numPr>
           <w:ilvl w:val="0"/>
           <w:numId w:val="13"/>
@@ -741,7 +741,7 @@
     </w:p>
     <w:p>
       <w:pPr>
-        <w:pStyle w:val="ListParagraph"/>
+        <w:pStyle w:val="a3"/>
         <w:numPr>
           <w:ilvl w:val="0"/>
           <w:numId w:val="13"/>
@@ -785,7 +785,7 @@
     </w:p>
     <w:p>
       <w:pPr>
-        <w:pStyle w:val="ListParagraph"/>
+        <w:pStyle w:val="a3"/>
         <w:numPr>
           <w:ilvl w:val="0"/>
           <w:numId w:val="13"/>
@@ -829,7 +829,7 @@
     </w:p>
     <w:p>
       <w:pPr>
-        <w:pStyle w:val="ListParagraph"/>
+        <w:pStyle w:val="a3"/>
         <w:numPr>
           <w:ilvl w:val="0"/>
           <w:numId w:val="13"/>
@@ -907,7 +907,7 @@
     </w:p>
     <w:p>
       <w:pPr>
-        <w:pStyle w:val="ListParagraph"/>
+        <w:pStyle w:val="a3"/>
         <w:numPr>
           <w:ilvl w:val="0"/>
           <w:numId w:val="13"/>
@@ -968,7 +968,7 @@
     </w:p>
     <w:p>
       <w:pPr>
-        <w:pStyle w:val="ListParagraph"/>
+        <w:pStyle w:val="a3"/>
         <w:numPr>
           <w:ilvl w:val="0"/>
           <w:numId w:val="13"/>
@@ -1029,7 +1029,7 @@
     </w:p>
     <w:p>
       <w:pPr>
-        <w:pStyle w:val="ListParagraph"/>
+        <w:pStyle w:val="a3"/>
         <w:numPr>
           <w:ilvl w:val="0"/>
           <w:numId w:val="7"/>
@@ -1050,7 +1050,7 @@
     </w:p>
     <w:p>
       <w:pPr>
-        <w:pStyle w:val="ListParagraph"/>
+        <w:pStyle w:val="a3"/>
         <w:numPr>
           <w:ilvl w:val="0"/>
           <w:numId w:val="4"/>
@@ -1088,7 +1088,7 @@
     </w:p>
     <w:p>
       <w:pPr>
-        <w:pStyle w:val="ListParagraph"/>
+        <w:pStyle w:val="a3"/>
         <w:numPr>
           <w:ilvl w:val="0"/>
           <w:numId w:val="4"/>
@@ -1214,7 +1214,7 @@
     </w:p>
     <w:p>
       <w:pPr>
-        <w:pStyle w:val="ListParagraph"/>
+        <w:pStyle w:val="a3"/>
         <w:numPr>
           <w:ilvl w:val="0"/>
           <w:numId w:val="4"/>
@@ -1280,7 +1280,7 @@
     </w:p>
     <w:p>
       <w:pPr>
-        <w:pStyle w:val="ListParagraph"/>
+        <w:pStyle w:val="a3"/>
         <w:numPr>
           <w:ilvl w:val="0"/>
           <w:numId w:val="4"/>
@@ -1326,7 +1326,7 @@
     </w:p>
     <w:p>
       <w:pPr>
-        <w:pStyle w:val="ListParagraph"/>
+        <w:pStyle w:val="a3"/>
         <w:numPr>
           <w:ilvl w:val="0"/>
           <w:numId w:val="7"/>
@@ -1347,7 +1347,7 @@
     </w:p>
     <w:p>
       <w:pPr>
-        <w:pStyle w:val="ListParagraph"/>
+        <w:pStyle w:val="a3"/>
         <w:numPr>
           <w:ilvl w:val="0"/>
           <w:numId w:val="4"/>
@@ -1385,7 +1385,7 @@
     </w:p>
     <w:p>
       <w:pPr>
-        <w:pStyle w:val="ListParagraph"/>
+        <w:pStyle w:val="a3"/>
         <w:numPr>
           <w:ilvl w:val="0"/>
           <w:numId w:val="4"/>
@@ -1431,7 +1431,7 @@
     </w:p>
     <w:p>
       <w:pPr>
-        <w:pStyle w:val="ListParagraph"/>
+        <w:pStyle w:val="a3"/>
         <w:numPr>
           <w:ilvl w:val="0"/>
           <w:numId w:val="4"/>
@@ -1484,7 +1484,7 @@
     </w:p>
     <w:p>
       <w:pPr>
-        <w:pStyle w:val="ListParagraph"/>
+        <w:pStyle w:val="a3"/>
         <w:numPr>
           <w:ilvl w:val="0"/>
           <w:numId w:val="4"/>
@@ -1529,7 +1529,7 @@
     </w:p>
     <w:p>
       <w:pPr>
-        <w:pStyle w:val="ListParagraph"/>
+        <w:pStyle w:val="a3"/>
         <w:numPr>
           <w:ilvl w:val="0"/>
           <w:numId w:val="4"/>
@@ -1574,7 +1574,7 @@
     </w:p>
     <w:p>
       <w:pPr>
-        <w:pStyle w:val="ListParagraph"/>
+        <w:pStyle w:val="a3"/>
         <w:numPr>
           <w:ilvl w:val="0"/>
           <w:numId w:val="4"/>
@@ -1629,7 +1629,7 @@
     </w:p>
     <w:p>
       <w:pPr>
-        <w:pStyle w:val="ListParagraph"/>
+        <w:pStyle w:val="a3"/>
         <w:numPr>
           <w:ilvl w:val="0"/>
           <w:numId w:val="4"/>
@@ -1684,7 +1684,7 @@
     </w:p>
     <w:p>
       <w:pPr>
-        <w:pStyle w:val="ListParagraph"/>
+        <w:pStyle w:val="a3"/>
         <w:numPr>
           <w:ilvl w:val="0"/>
           <w:numId w:val="4"/>
@@ -1756,7 +1756,7 @@
     </w:p>
     <w:p>
       <w:pPr>
-        <w:pStyle w:val="ListParagraph"/>
+        <w:pStyle w:val="a3"/>
         <w:numPr>
           <w:ilvl w:val="0"/>
           <w:numId w:val="4"/>
@@ -1834,7 +1834,7 @@
     </w:p>
     <w:p>
       <w:pPr>
-        <w:pStyle w:val="ListParagraph"/>
+        <w:pStyle w:val="a3"/>
         <w:numPr>
           <w:ilvl w:val="0"/>
           <w:numId w:val="4"/>
@@ -1912,7 +1912,7 @@
     </w:p>
     <w:p>
       <w:pPr>
-        <w:pStyle w:val="ListParagraph"/>
+        <w:pStyle w:val="a3"/>
         <w:numPr>
           <w:ilvl w:val="0"/>
           <w:numId w:val="4"/>
@@ -1949,7 +1949,7 @@
     </w:p>
     <w:p>
       <w:pPr>
-        <w:pStyle w:val="ListParagraph"/>
+        <w:pStyle w:val="a3"/>
         <w:numPr>
           <w:ilvl w:val="0"/>
           <w:numId w:val="7"/>
@@ -1970,7 +1970,7 @@
     </w:p>
     <w:p>
       <w:pPr>
-        <w:pStyle w:val="ListParagraph"/>
+        <w:pStyle w:val="a3"/>
         <w:numPr>
           <w:ilvl w:val="0"/>
           <w:numId w:val="4"/>
@@ -2008,7 +2008,7 @@
     </w:p>
     <w:p>
       <w:pPr>
-        <w:pStyle w:val="ListParagraph"/>
+        <w:pStyle w:val="a3"/>
         <w:numPr>
           <w:ilvl w:val="0"/>
           <w:numId w:val="4"/>
@@ -2046,7 +2046,7 @@
     </w:p>
     <w:p>
       <w:pPr>
-        <w:pStyle w:val="ListParagraph"/>
+        <w:pStyle w:val="a3"/>
         <w:numPr>
           <w:ilvl w:val="0"/>
           <w:numId w:val="4"/>
@@ -2084,7 +2084,7 @@
     </w:p>
     <w:p>
       <w:pPr>
-        <w:pStyle w:val="ListParagraph"/>
+        <w:pStyle w:val="a3"/>
         <w:numPr>
           <w:ilvl w:val="0"/>
           <w:numId w:val="4"/>
@@ -2121,7 +2121,7 @@
     </w:p>
     <w:p>
       <w:pPr>
-        <w:pStyle w:val="ListParagraph"/>
+        <w:pStyle w:val="a3"/>
         <w:numPr>
           <w:ilvl w:val="0"/>
           <w:numId w:val="4"/>
@@ -2174,7 +2174,7 @@
     </w:p>
     <w:p>
       <w:pPr>
-        <w:pStyle w:val="ListParagraph"/>
+        <w:pStyle w:val="a3"/>
         <w:numPr>
           <w:ilvl w:val="0"/>
           <w:numId w:val="4"/>
@@ -2243,7 +2243,7 @@
     </w:p>
     <w:p>
       <w:pPr>
-        <w:pStyle w:val="ListParagraph"/>
+        <w:pStyle w:val="a3"/>
         <w:numPr>
           <w:ilvl w:val="0"/>
           <w:numId w:val="4"/>
@@ -2288,7 +2288,7 @@
     </w:p>
     <w:p>
       <w:pPr>
-        <w:pStyle w:val="ListParagraph"/>
+        <w:pStyle w:val="a3"/>
         <w:numPr>
           <w:ilvl w:val="0"/>
           <w:numId w:val="4"/>
@@ -2341,7 +2341,7 @@
     </w:p>
     <w:p>
       <w:pPr>
-        <w:pStyle w:val="ListParagraph"/>
+        <w:pStyle w:val="a3"/>
         <w:numPr>
           <w:ilvl w:val="0"/>
           <w:numId w:val="4"/>
@@ -2722,7 +2722,7 @@
     </w:p>
     <w:p>
       <w:pPr>
-        <w:pStyle w:val="ListParagraph"/>
+        <w:pStyle w:val="a3"/>
         <w:numPr>
           <w:ilvl w:val="0"/>
           <w:numId w:val="4"/>
@@ -2767,7 +2767,7 @@
     </w:p>
     <w:p>
       <w:pPr>
-        <w:pStyle w:val="ListParagraph"/>
+        <w:pStyle w:val="a3"/>
         <w:numPr>
           <w:ilvl w:val="0"/>
           <w:numId w:val="4"/>
@@ -2804,7 +2804,7 @@
     </w:p>
     <w:p>
       <w:pPr>
-        <w:pStyle w:val="ListParagraph"/>
+        <w:pStyle w:val="a3"/>
         <w:numPr>
           <w:ilvl w:val="0"/>
           <w:numId w:val="4"/>
@@ -2883,7 +2883,7 @@
     </w:p>
     <w:p>
       <w:pPr>
-        <w:pStyle w:val="ListParagraph"/>
+        <w:pStyle w:val="a3"/>
         <w:numPr>
           <w:ilvl w:val="0"/>
           <w:numId w:val="4"/>
@@ -2938,7 +2938,7 @@
     </w:p>
     <w:p>
       <w:pPr>
-        <w:pStyle w:val="ListParagraph"/>
+        <w:pStyle w:val="a3"/>
         <w:numPr>
           <w:ilvl w:val="0"/>
           <w:numId w:val="4"/>
@@ -2986,7 +2986,7 @@
     </w:p>
     <w:p>
       <w:pPr>
-        <w:pStyle w:val="ListParagraph"/>
+        <w:pStyle w:val="a3"/>
         <w:numPr>
           <w:ilvl w:val="0"/>
           <w:numId w:val="9"/>
@@ -3023,7 +3023,7 @@
     </w:p>
     <w:p>
       <w:pPr>
-        <w:pStyle w:val="ListParagraph"/>
+        <w:pStyle w:val="a3"/>
         <w:numPr>
           <w:ilvl w:val="0"/>
           <w:numId w:val="11"/>
@@ -3080,7 +3080,7 @@
     </w:p>
     <w:tbl>
       <w:tblPr>
-        <w:tblStyle w:val="TableGrid"/>
+        <w:tblStyle w:val="a6"/>
         <w:tblW w:w="0" w:type="auto"/>
         <w:tblInd w:w="360" w:type="dxa"/>
         <w:tblLook w:val="04A0" w:firstRow="1" w:lastRow="0" w:firstColumn="1" w:lastColumn="0" w:noHBand="0" w:noVBand="1"/>
@@ -3101,7 +3101,7 @@
           </w:tcPr>
           <w:p>
             <w:pPr>
-              <w:pStyle w:val="ListParagraph"/>
+              <w:pStyle w:val="a3"/>
               <w:ind w:left="0"/>
               <w:rPr>
                 <w:rFonts w:ascii="Times New Roman" w:hAnsi="Times New Roman" w:cs="Times New Roman"/>
@@ -3135,7 +3135,7 @@
           </w:tcPr>
           <w:p>
             <w:pPr>
-              <w:pStyle w:val="ListParagraph"/>
+              <w:pStyle w:val="a3"/>
               <w:ind w:left="0"/>
               <w:rPr>
                 <w:rFonts w:ascii="Times New Roman" w:hAnsi="Times New Roman" w:cs="Times New Roman"/>
@@ -3188,7 +3188,7 @@
           </w:tcPr>
           <w:p>
             <w:pPr>
-              <w:pStyle w:val="ListParagraph"/>
+              <w:pStyle w:val="a3"/>
               <w:ind w:left="0"/>
               <w:rPr>
                 <w:rFonts w:ascii="Times New Roman" w:hAnsi="Times New Roman" w:cs="Times New Roman"/>
@@ -3232,7 +3232,7 @@
           </w:tcPr>
           <w:p>
             <w:pPr>
-              <w:pStyle w:val="ListParagraph"/>
+              <w:pStyle w:val="a3"/>
               <w:ind w:left="0"/>
               <w:rPr>
                 <w:rFonts w:ascii="Times New Roman" w:hAnsi="Times New Roman" w:cs="Times New Roman"/>
@@ -3276,7 +3276,7 @@
           </w:tcPr>
           <w:p>
             <w:pPr>
-              <w:pStyle w:val="ListParagraph"/>
+              <w:pStyle w:val="a3"/>
               <w:ind w:left="0"/>
               <w:rPr>
                 <w:rFonts w:ascii="Times New Roman" w:hAnsi="Times New Roman" w:cs="Times New Roman"/>
@@ -3319,7 +3319,7 @@
           </w:tcPr>
           <w:p>
             <w:pPr>
-              <w:pStyle w:val="ListParagraph"/>
+              <w:pStyle w:val="a3"/>
               <w:ind w:left="0"/>
               <w:rPr>
                 <w:rFonts w:ascii="Times New Roman" w:hAnsi="Times New Roman" w:cs="Times New Roman"/>
@@ -3363,7 +3363,7 @@
           </w:tcPr>
           <w:p>
             <w:pPr>
-              <w:pStyle w:val="ListParagraph"/>
+              <w:pStyle w:val="a3"/>
               <w:ind w:left="0"/>
               <w:rPr>
                 <w:rFonts w:ascii="Times New Roman" w:hAnsi="Times New Roman" w:cs="Times New Roman"/>
@@ -3410,7 +3410,7 @@
           </w:tcPr>
           <w:p>
             <w:pPr>
-              <w:pStyle w:val="ListParagraph"/>
+              <w:pStyle w:val="a3"/>
               <w:ind w:left="0"/>
               <w:rPr>
                 <w:rFonts w:ascii="Times New Roman" w:hAnsi="Times New Roman" w:cs="Times New Roman"/>
@@ -3445,7 +3445,7 @@
           </w:tcPr>
           <w:p>
             <w:pPr>
-              <w:pStyle w:val="ListParagraph"/>
+              <w:pStyle w:val="a3"/>
               <w:ind w:left="0"/>
               <w:rPr>
                 <w:rFonts w:ascii="Times New Roman" w:hAnsi="Times New Roman" w:cs="Times New Roman"/>
@@ -3479,7 +3479,7 @@
           </w:tcPr>
           <w:p>
             <w:pPr>
-              <w:pStyle w:val="ListParagraph"/>
+              <w:pStyle w:val="a3"/>
               <w:ind w:left="0"/>
               <w:rPr>
                 <w:rFonts w:ascii="Times New Roman" w:hAnsi="Times New Roman" w:cs="Times New Roman"/>
@@ -3522,7 +3522,7 @@
           </w:tcPr>
           <w:p>
             <w:pPr>
-              <w:pStyle w:val="ListParagraph"/>
+              <w:pStyle w:val="a3"/>
               <w:ind w:left="0"/>
               <w:rPr>
                 <w:rFonts w:ascii="Times New Roman" w:hAnsi="Times New Roman" w:cs="Times New Roman"/>
@@ -3548,7 +3548,7 @@
           </w:tcPr>
           <w:p>
             <w:pPr>
-              <w:pStyle w:val="ListParagraph"/>
+              <w:pStyle w:val="a3"/>
               <w:ind w:left="0"/>
               <w:rPr>
                 <w:rFonts w:ascii="Times New Roman" w:hAnsi="Times New Roman" w:cs="Times New Roman"/>
@@ -3574,7 +3574,7 @@
           </w:tcPr>
           <w:p>
             <w:pPr>
-              <w:pStyle w:val="ListParagraph"/>
+              <w:pStyle w:val="a3"/>
               <w:ind w:left="0"/>
               <w:rPr>
                 <w:rFonts w:ascii="Times New Roman" w:hAnsi="Times New Roman" w:cs="Times New Roman"/>
@@ -3600,7 +3600,7 @@
           </w:tcPr>
           <w:p>
             <w:pPr>
-              <w:pStyle w:val="ListParagraph"/>
+              <w:pStyle w:val="a3"/>
               <w:ind w:left="0"/>
               <w:rPr>
                 <w:rFonts w:ascii="Times New Roman" w:hAnsi="Times New Roman" w:cs="Times New Roman"/>
@@ -3628,7 +3628,7 @@
           </w:tcPr>
           <w:p>
             <w:pPr>
-              <w:pStyle w:val="ListParagraph"/>
+              <w:pStyle w:val="a3"/>
               <w:ind w:left="0"/>
               <w:rPr>
                 <w:rFonts w:ascii="Times New Roman" w:hAnsi="Times New Roman" w:cs="Times New Roman"/>
@@ -3645,7 +3645,7 @@
           </w:tcPr>
           <w:p>
             <w:pPr>
-              <w:pStyle w:val="ListParagraph"/>
+              <w:pStyle w:val="a3"/>
               <w:ind w:left="0"/>
               <w:rPr>
                 <w:rFonts w:ascii="Times New Roman" w:hAnsi="Times New Roman" w:cs="Times New Roman"/>
@@ -3662,7 +3662,7 @@
           </w:tcPr>
           <w:p>
             <w:pPr>
-              <w:pStyle w:val="ListParagraph"/>
+              <w:pStyle w:val="a3"/>
               <w:ind w:left="0"/>
               <w:rPr>
                 <w:rFonts w:ascii="Times New Roman" w:hAnsi="Times New Roman" w:cs="Times New Roman"/>
@@ -3688,7 +3688,7 @@
           </w:tcPr>
           <w:p>
             <w:pPr>
-              <w:pStyle w:val="ListParagraph"/>
+              <w:pStyle w:val="a3"/>
               <w:ind w:left="0"/>
               <w:rPr>
                 <w:rFonts w:ascii="Times New Roman" w:hAnsi="Times New Roman" w:cs="Times New Roman"/>
@@ -3714,7 +3714,7 @@
           </w:tcPr>
           <w:p>
             <w:pPr>
-              <w:pStyle w:val="ListParagraph"/>
+              <w:pStyle w:val="a3"/>
               <w:ind w:left="0"/>
               <w:rPr>
                 <w:rFonts w:ascii="Times New Roman" w:hAnsi="Times New Roman" w:cs="Times New Roman"/>
@@ -3740,7 +3740,7 @@
           </w:tcPr>
           <w:p>
             <w:pPr>
-              <w:pStyle w:val="ListParagraph"/>
+              <w:pStyle w:val="a3"/>
               <w:ind w:left="0"/>
               <w:rPr>
                 <w:rFonts w:ascii="Times New Roman" w:hAnsi="Times New Roman" w:cs="Times New Roman"/>
@@ -3766,7 +3766,7 @@
           </w:tcPr>
           <w:p>
             <w:pPr>
-              <w:pStyle w:val="ListParagraph"/>
+              <w:pStyle w:val="a3"/>
               <w:ind w:left="0"/>
               <w:rPr>
                 <w:rFonts w:ascii="Times New Roman" w:hAnsi="Times New Roman" w:cs="Times New Roman"/>
@@ -3795,7 +3795,7 @@
           </w:tcPr>
           <w:p>
             <w:pPr>
-              <w:pStyle w:val="ListParagraph"/>
+              <w:pStyle w:val="a3"/>
               <w:ind w:left="0"/>
               <w:rPr>
                 <w:rFonts w:ascii="Times New Roman" w:hAnsi="Times New Roman" w:cs="Times New Roman"/>
@@ -3812,7 +3812,7 @@
           </w:tcPr>
           <w:p>
             <w:pPr>
-              <w:pStyle w:val="ListParagraph"/>
+              <w:pStyle w:val="a3"/>
               <w:ind w:left="0"/>
               <w:rPr>
                 <w:rFonts w:ascii="Times New Roman" w:hAnsi="Times New Roman" w:cs="Times New Roman"/>
@@ -3829,7 +3829,7 @@
           </w:tcPr>
           <w:p>
             <w:pPr>
-              <w:pStyle w:val="ListParagraph"/>
+              <w:pStyle w:val="a3"/>
               <w:ind w:left="0"/>
               <w:rPr>
                 <w:rFonts w:ascii="Times New Roman" w:hAnsi="Times New Roman" w:cs="Times New Roman"/>
@@ -3855,7 +3855,7 @@
           </w:tcPr>
           <w:p>
             <w:pPr>
-              <w:pStyle w:val="ListParagraph"/>
+              <w:pStyle w:val="a3"/>
               <w:ind w:left="0"/>
               <w:rPr>
                 <w:rFonts w:ascii="Times New Roman" w:hAnsi="Times New Roman" w:cs="Times New Roman"/>
@@ -3881,7 +3881,7 @@
           </w:tcPr>
           <w:p>
             <w:pPr>
-              <w:pStyle w:val="ListParagraph"/>
+              <w:pStyle w:val="a3"/>
               <w:ind w:left="0"/>
               <w:rPr>
                 <w:rFonts w:ascii="Times New Roman" w:hAnsi="Times New Roman" w:cs="Times New Roman"/>
@@ -3907,7 +3907,7 @@
           </w:tcPr>
           <w:p>
             <w:pPr>
-              <w:pStyle w:val="ListParagraph"/>
+              <w:pStyle w:val="a3"/>
               <w:ind w:left="0"/>
               <w:rPr>
                 <w:rFonts w:ascii="Times New Roman" w:hAnsi="Times New Roman" w:cs="Times New Roman"/>
@@ -3933,7 +3933,7 @@
           </w:tcPr>
           <w:p>
             <w:pPr>
-              <w:pStyle w:val="ListParagraph"/>
+              <w:pStyle w:val="a3"/>
               <w:ind w:left="0"/>
               <w:rPr>
                 <w:rFonts w:ascii="Times New Roman" w:hAnsi="Times New Roman" w:cs="Times New Roman"/>
@@ -3957,7 +3957,7 @@
     </w:tbl>
     <w:p>
       <w:pPr>
-        <w:pStyle w:val="ListParagraph"/>
+        <w:pStyle w:val="a3"/>
         <w:ind w:left="360"/>
         <w:rPr>
           <w:rFonts w:ascii="Times New Roman" w:hAnsi="Times New Roman" w:cs="Times New Roman"/>
@@ -4008,7 +4008,7 @@
     </w:p>
     <w:p>
       <w:pPr>
-        <w:pStyle w:val="ListParagraph"/>
+        <w:pStyle w:val="a3"/>
         <w:numPr>
           <w:ilvl w:val="0"/>
           <w:numId w:val="11"/>
@@ -4075,7 +4075,7 @@
     </w:p>
     <w:p>
       <w:pPr>
-        <w:pStyle w:val="ListParagraph"/>
+        <w:pStyle w:val="a3"/>
         <w:numPr>
           <w:ilvl w:val="0"/>
           <w:numId w:val="11"/>
@@ -4182,7 +4182,409 @@
     </w:p>
     <w:p>
       <w:pPr>
-        <w:pStyle w:val="ListParagraph"/>
+        <w:pStyle w:val="a3"/>
+        <w:rPr>
+          <w:rFonts w:ascii="Times New Roman" w:hAnsi="Times New Roman" w:cs="Times New Roman"/>
+          <w:sz w:val="28"/>
+          <w:szCs w:val="28"/>
+        </w:rPr>
+      </w:pPr>
+    </w:p>
+    <w:tbl>
+      <w:tblPr>
+        <w:tblStyle w:val="a6"/>
+        <w:tblW w:w="0" w:type="auto"/>
+        <w:tblInd w:w="360" w:type="dxa"/>
+        <w:tblLook w:val="04A0" w:firstRow="1" w:lastRow="0" w:firstColumn="1" w:lastColumn="0" w:noHBand="0" w:noVBand="1"/>
+      </w:tblPr>
+      <w:tblGrid>
+        <w:gridCol w:w="1534"/>
+        <w:gridCol w:w="1534"/>
+        <w:gridCol w:w="1534"/>
+        <w:gridCol w:w="1535"/>
+        <w:gridCol w:w="1535"/>
+        <w:gridCol w:w="1535"/>
+        <w:gridCol w:w="1535"/>
+      </w:tblGrid>
+      <w:tr>
+        <w:tc>
+          <w:tcPr>
+            <w:tcW w:w="1586" w:type="dxa"/>
+          </w:tcPr>
+          <w:p>
+            <w:pPr>
+              <w:pStyle w:val="a3"/>
+              <w:ind w:left="0"/>
+              <w:jc w:val="both"/>
+              <w:rPr>
+                <w:rFonts w:ascii="Times New Roman" w:hAnsi="Times New Roman" w:cs="Times New Roman"/>
+                <w:sz w:val="28"/>
+                <w:szCs w:val="28"/>
+              </w:rPr>
+            </w:pPr>
+          </w:p>
+        </w:tc>
+        <w:tc>
+          <w:tcPr>
+            <w:tcW w:w="1586" w:type="dxa"/>
+          </w:tcPr>
+          <w:p>
+            <w:pPr>
+              <w:pStyle w:val="a3"/>
+              <w:ind w:left="0"/>
+              <w:jc w:val="both"/>
+              <w:rPr>
+                <w:rFonts w:ascii="Times New Roman" w:hAnsi="Times New Roman" w:cs="Times New Roman"/>
+                <w:sz w:val="28"/>
+                <w:szCs w:val="28"/>
+              </w:rPr>
+            </w:pPr>
+          </w:p>
+        </w:tc>
+        <w:tc>
+          <w:tcPr>
+            <w:tcW w:w="1586" w:type="dxa"/>
+          </w:tcPr>
+          <w:p>
+            <w:pPr>
+              <w:pStyle w:val="a3"/>
+              <w:ind w:left="0"/>
+              <w:jc w:val="both"/>
+              <w:rPr>
+                <w:rFonts w:ascii="Times New Roman" w:hAnsi="Times New Roman" w:cs="Times New Roman"/>
+                <w:sz w:val="28"/>
+                <w:szCs w:val="28"/>
+              </w:rPr>
+            </w:pPr>
+          </w:p>
+        </w:tc>
+        <w:tc>
+          <w:tcPr>
+            <w:tcW w:w="1586" w:type="dxa"/>
+          </w:tcPr>
+          <w:p>
+            <w:pPr>
+              <w:pStyle w:val="a3"/>
+              <w:ind w:left="0"/>
+              <w:jc w:val="both"/>
+              <w:rPr>
+                <w:rFonts w:ascii="Times New Roman" w:hAnsi="Times New Roman" w:cs="Times New Roman"/>
+                <w:sz w:val="28"/>
+                <w:szCs w:val="28"/>
+              </w:rPr>
+            </w:pPr>
+          </w:p>
+        </w:tc>
+        <w:tc>
+          <w:tcPr>
+            <w:tcW w:w="1586" w:type="dxa"/>
+          </w:tcPr>
+          <w:p>
+            <w:pPr>
+              <w:pStyle w:val="a3"/>
+              <w:ind w:left="0"/>
+              <w:jc w:val="both"/>
+              <w:rPr>
+                <w:rFonts w:ascii="Times New Roman" w:hAnsi="Times New Roman" w:cs="Times New Roman"/>
+                <w:sz w:val="28"/>
+                <w:szCs w:val="28"/>
+              </w:rPr>
+            </w:pPr>
+          </w:p>
+        </w:tc>
+        <w:tc>
+          <w:tcPr>
+            <w:tcW w:w="1586" w:type="dxa"/>
+          </w:tcPr>
+          <w:p>
+            <w:pPr>
+              <w:pStyle w:val="a3"/>
+              <w:ind w:left="0"/>
+              <w:jc w:val="both"/>
+              <w:rPr>
+                <w:rFonts w:ascii="Times New Roman" w:hAnsi="Times New Roman" w:cs="Times New Roman"/>
+                <w:sz w:val="28"/>
+                <w:szCs w:val="28"/>
+              </w:rPr>
+            </w:pPr>
+          </w:p>
+        </w:tc>
+        <w:tc>
+          <w:tcPr>
+            <w:tcW w:w="1586" w:type="dxa"/>
+          </w:tcPr>
+          <w:p>
+            <w:pPr>
+              <w:pStyle w:val="a3"/>
+              <w:ind w:left="0"/>
+              <w:jc w:val="both"/>
+              <w:rPr>
+                <w:rFonts w:ascii="Times New Roman" w:hAnsi="Times New Roman" w:cs="Times New Roman"/>
+                <w:sz w:val="28"/>
+                <w:szCs w:val="28"/>
+              </w:rPr>
+            </w:pPr>
+          </w:p>
+        </w:tc>
+      </w:tr>
+      <w:tr>
+        <w:tc>
+          <w:tcPr>
+            <w:tcW w:w="1586" w:type="dxa"/>
+          </w:tcPr>
+          <w:p>
+            <w:pPr>
+              <w:pStyle w:val="a3"/>
+              <w:ind w:left="0"/>
+              <w:jc w:val="both"/>
+              <w:rPr>
+                <w:rFonts w:ascii="Times New Roman" w:hAnsi="Times New Roman" w:cs="Times New Roman"/>
+                <w:sz w:val="28"/>
+                <w:szCs w:val="28"/>
+              </w:rPr>
+            </w:pPr>
+          </w:p>
+        </w:tc>
+        <w:tc>
+          <w:tcPr>
+            <w:tcW w:w="1586" w:type="dxa"/>
+          </w:tcPr>
+          <w:p>
+            <w:pPr>
+              <w:pStyle w:val="a3"/>
+              <w:ind w:left="0"/>
+              <w:jc w:val="both"/>
+              <w:rPr>
+                <w:rFonts w:ascii="Times New Roman" w:hAnsi="Times New Roman" w:cs="Times New Roman"/>
+                <w:sz w:val="28"/>
+                <w:szCs w:val="28"/>
+              </w:rPr>
+            </w:pPr>
+          </w:p>
+        </w:tc>
+        <w:tc>
+          <w:tcPr>
+            <w:tcW w:w="1586" w:type="dxa"/>
+          </w:tcPr>
+          <w:p>
+            <w:pPr>
+              <w:pStyle w:val="a3"/>
+              <w:ind w:left="0"/>
+              <w:jc w:val="both"/>
+              <w:rPr>
+                <w:rFonts w:ascii="Times New Roman" w:hAnsi="Times New Roman" w:cs="Times New Roman"/>
+                <w:sz w:val="28"/>
+                <w:szCs w:val="28"/>
+              </w:rPr>
+            </w:pPr>
+          </w:p>
+        </w:tc>
+        <w:tc>
+          <w:tcPr>
+            <w:tcW w:w="1586" w:type="dxa"/>
+          </w:tcPr>
+          <w:p>
+            <w:pPr>
+              <w:pStyle w:val="a3"/>
+              <w:ind w:left="0"/>
+              <w:jc w:val="both"/>
+              <w:rPr>
+                <w:rFonts w:ascii="Times New Roman" w:hAnsi="Times New Roman" w:cs="Times New Roman"/>
+                <w:sz w:val="28"/>
+                <w:szCs w:val="28"/>
+              </w:rPr>
+            </w:pPr>
+          </w:p>
+        </w:tc>
+        <w:tc>
+          <w:tcPr>
+            <w:tcW w:w="1586" w:type="dxa"/>
+          </w:tcPr>
+          <w:p>
+            <w:pPr>
+              <w:pStyle w:val="a3"/>
+              <w:ind w:left="0"/>
+              <w:jc w:val="both"/>
+              <w:rPr>
+                <w:rFonts w:ascii="Times New Roman" w:hAnsi="Times New Roman" w:cs="Times New Roman"/>
+                <w:sz w:val="28"/>
+                <w:szCs w:val="28"/>
+              </w:rPr>
+            </w:pPr>
+          </w:p>
+        </w:tc>
+        <w:tc>
+          <w:tcPr>
+            <w:tcW w:w="1586" w:type="dxa"/>
+          </w:tcPr>
+          <w:p>
+            <w:pPr>
+              <w:pStyle w:val="a3"/>
+              <w:ind w:left="0"/>
+              <w:jc w:val="both"/>
+              <w:rPr>
+                <w:rFonts w:ascii="Times New Roman" w:hAnsi="Times New Roman" w:cs="Times New Roman"/>
+                <w:sz w:val="28"/>
+                <w:szCs w:val="28"/>
+              </w:rPr>
+            </w:pPr>
+          </w:p>
+        </w:tc>
+        <w:tc>
+          <w:tcPr>
+            <w:tcW w:w="1586" w:type="dxa"/>
+          </w:tcPr>
+          <w:p>
+            <w:pPr>
+              <w:pStyle w:val="a3"/>
+              <w:ind w:left="0"/>
+              <w:jc w:val="both"/>
+              <w:rPr>
+                <w:rFonts w:ascii="Times New Roman" w:hAnsi="Times New Roman" w:cs="Times New Roman"/>
+                <w:sz w:val="28"/>
+                <w:szCs w:val="28"/>
+              </w:rPr>
+            </w:pPr>
+          </w:p>
+        </w:tc>
+      </w:tr>
+      <w:tr>
+        <w:tc>
+          <w:tcPr>
+            <w:tcW w:w="1586" w:type="dxa"/>
+          </w:tcPr>
+          <w:p>
+            <w:pPr>
+              <w:pStyle w:val="a3"/>
+              <w:ind w:left="0"/>
+              <w:jc w:val="both"/>
+              <w:rPr>
+                <w:rFonts w:ascii="Times New Roman" w:hAnsi="Times New Roman" w:cs="Times New Roman"/>
+                <w:sz w:val="28"/>
+                <w:szCs w:val="28"/>
+              </w:rPr>
+            </w:pPr>
+          </w:p>
+        </w:tc>
+        <w:tc>
+          <w:tcPr>
+            <w:tcW w:w="1586" w:type="dxa"/>
+          </w:tcPr>
+          <w:p>
+            <w:pPr>
+              <w:pStyle w:val="a3"/>
+              <w:ind w:left="0"/>
+              <w:jc w:val="both"/>
+              <w:rPr>
+                <w:rFonts w:ascii="Times New Roman" w:hAnsi="Times New Roman" w:cs="Times New Roman"/>
+                <w:sz w:val="28"/>
+                <w:szCs w:val="28"/>
+              </w:rPr>
+            </w:pPr>
+          </w:p>
+        </w:tc>
+        <w:tc>
+          <w:tcPr>
+            <w:tcW w:w="1586" w:type="dxa"/>
+          </w:tcPr>
+          <w:p>
+            <w:pPr>
+              <w:pStyle w:val="a3"/>
+              <w:ind w:left="0"/>
+              <w:jc w:val="both"/>
+              <w:rPr>
+                <w:rFonts w:ascii="Times New Roman" w:hAnsi="Times New Roman" w:cs="Times New Roman"/>
+                <w:sz w:val="28"/>
+                <w:szCs w:val="28"/>
+              </w:rPr>
+            </w:pPr>
+          </w:p>
+        </w:tc>
+        <w:tc>
+          <w:tcPr>
+            <w:tcW w:w="1586" w:type="dxa"/>
+          </w:tcPr>
+          <w:p>
+            <w:pPr>
+              <w:pStyle w:val="a3"/>
+              <w:ind w:left="0"/>
+              <w:jc w:val="both"/>
+              <w:rPr>
+                <w:rFonts w:ascii="Times New Roman" w:hAnsi="Times New Roman" w:cs="Times New Roman"/>
+                <w:sz w:val="28"/>
+                <w:szCs w:val="28"/>
+              </w:rPr>
+            </w:pPr>
+          </w:p>
+        </w:tc>
+        <w:tc>
+          <w:tcPr>
+            <w:tcW w:w="1586" w:type="dxa"/>
+          </w:tcPr>
+          <w:p>
+            <w:pPr>
+              <w:pStyle w:val="a3"/>
+              <w:ind w:left="0"/>
+              <w:jc w:val="both"/>
+              <w:rPr>
+                <w:rFonts w:ascii="Times New Roman" w:hAnsi="Times New Roman" w:cs="Times New Roman"/>
+                <w:sz w:val="28"/>
+                <w:szCs w:val="28"/>
+              </w:rPr>
+            </w:pPr>
+          </w:p>
+        </w:tc>
+        <w:tc>
+          <w:tcPr>
+            <w:tcW w:w="1586" w:type="dxa"/>
+          </w:tcPr>
+          <w:p>
+            <w:pPr>
+              <w:pStyle w:val="a3"/>
+              <w:ind w:left="0"/>
+              <w:jc w:val="both"/>
+              <w:rPr>
+                <w:rFonts w:ascii="Times New Roman" w:hAnsi="Times New Roman" w:cs="Times New Roman"/>
+                <w:sz w:val="28"/>
+                <w:szCs w:val="28"/>
+              </w:rPr>
+            </w:pPr>
+          </w:p>
+        </w:tc>
+        <w:tc>
+          <w:tcPr>
+            <w:tcW w:w="1586" w:type="dxa"/>
+          </w:tcPr>
+          <w:p>
+            <w:pPr>
+              <w:pStyle w:val="a3"/>
+              <w:ind w:left="0"/>
+              <w:jc w:val="both"/>
+              <w:rPr>
+                <w:rFonts w:ascii="Times New Roman" w:hAnsi="Times New Roman" w:cs="Times New Roman"/>
+                <w:sz w:val="28"/>
+                <w:szCs w:val="28"/>
+              </w:rPr>
+            </w:pPr>
+          </w:p>
+        </w:tc>
+      </w:tr>
+    </w:tbl>
+    <w:p>
+      <w:pPr>
+        <w:pStyle w:val="a3"/>
+        <w:ind w:left="360"/>
+        <w:jc w:val="both"/>
+        <w:rPr>
+          <w:rFonts w:ascii="Times New Roman" w:hAnsi="Times New Roman" w:cs="Times New Roman"/>
+          <w:sz w:val="28"/>
+          <w:szCs w:val="28"/>
+        </w:rPr>
+      </w:pPr>
+    </w:p>
+    <w:p>
+      <w:pPr>
+        <w:pStyle w:val="a3"/>
         <w:numPr>
           <w:ilvl w:val="0"/>
           <w:numId w:val="11"/>
@@ -4198,7 +4600,6 @@
           <w:noProof/>
           <w:lang w:eastAsia="ru-RU"/>
         </w:rPr>
-        <w:lastRenderedPageBreak/>
         <w:drawing>
           <wp:inline distT="0" distB="0" distL="0" distR="0" wp14:anchorId="29AC7CA0" wp14:editId="714D7360">
             <wp:extent cx="6191264" cy="3928262"/>
@@ -4295,7 +4696,7 @@
 </file>
 
 <file path=word/numbering.xml><?xml version="1.0" encoding="utf-8"?>
-<w:numbering xmlns:wpc="http://schemas.microsoft.com/office/word/2010/wordprocessingCanvas" xmlns:cx="http://schemas.microsoft.com/office/drawing/2014/chartex" xmlns:cx1="http://schemas.microsoft.com/office/drawing/2015/9/8/chartex" xmlns:cx2="http://schemas.microsoft.com/office/drawing/2015/10/21/chartex" xmlns:cx3="http://schemas.microsoft.com/office/drawing/2016/5/9/chartex" xmlns:cx4="http://schemas.microsoft.com/office/drawing/2016/5/10/chartex" xmlns:cx5="http://schemas.microsoft.com/office/drawing/2016/5/11/chartex" xmlns:cx6="http://schemas.microsoft.com/office/drawing/2016/5/12/chartex" xmlns:cx7="http://schemas.microsoft.com/office/drawing/2016/5/13/chartex" xmlns:cx8="http://schemas.microsoft.com/office/drawing/2016/5/14/chartex" xmlns:mc="http://schemas.openxmlformats.org/markup-compatibility/2006" xmlns:aink="http://schemas.microsoft.com/office/drawing/2016/ink" xmlns:am3d="http://schemas.microsoft.com/office/drawing/2017/model3d" xmlns:o="urn:schemas-microsoft-com:office:office" xmlns:oel="http://schemas.microsoft.com/office/2019/extlst" xmlns:r="http://schemas.openxmlformats.org/officeDocument/2006/relationships" xmlns:m="http://schemas.openxmlformats.org/officeDocument/2006/math" xmlns:v="urn:schemas-microsoft-com:vml" xmlns:wp14="http://schemas.microsoft.com/office/word/2010/wordprocessingDrawing" xmlns:wp="http://schemas.openxmlformats.org/drawingml/2006/wordprocessingDrawing" xmlns:w10="urn:schemas-microsoft-com:office:word" xmlns:w="http://schemas.openxmlformats.org/wordprocessingml/2006/main" xmlns:w14="http://schemas.microsoft.com/office/word/2010/wordml" xmlns:w15="http://schemas.microsoft.com/office/word/2012/wordml" xmlns:w16cex="http://schemas.microsoft.com/office/word/2018/wordml/cex" xmlns:w16cid="http://schemas.microsoft.com/office/word/2016/wordml/cid" xmlns:w16="http://schemas.microsoft.com/office/word/2018/wordml" xmlns:w16du="http://schemas.microsoft.com/office/word/2023/wordml/word16du" xmlns:w16sdtdh="http://schemas.microsoft.com/office/word/2020/wordml/sdtdatahash" xmlns:w16sdtfl="http://schemas.microsoft.com/office/word/2024/wordml/sdtformatlock" xmlns:w16se="http://schemas.microsoft.com/office/word/2015/wordml/symex" xmlns:wpg="http://schemas.microsoft.com/office/word/2010/wordprocessingGroup" xmlns:wpi="http://schemas.microsoft.com/office/word/2010/wordprocessingInk" xmlns:wne="http://schemas.microsoft.com/office/word/2006/wordml" xmlns:wps="http://schemas.microsoft.com/office/word/2010/wordprocessingShape" mc:Ignorable="w14 w15 w16se w16cid w16 w16cex w16sdtdh w16sdtfl w16du wp14">
+<w:numbering xmlns:wpc="http://schemas.microsoft.com/office/word/2010/wordprocessingCanvas" xmlns:cx="http://schemas.microsoft.com/office/drawing/2014/chartex" xmlns:cx1="http://schemas.microsoft.com/office/drawing/2015/9/8/chartex" xmlns:cx2="http://schemas.microsoft.com/office/drawing/2015/10/21/chartex" xmlns:cx3="http://schemas.microsoft.com/office/drawing/2016/5/9/chartex" xmlns:cx4="http://schemas.microsoft.com/office/drawing/2016/5/10/chartex" xmlns:cx5="http://schemas.microsoft.com/office/drawing/2016/5/11/chartex" xmlns:cx6="http://schemas.microsoft.com/office/drawing/2016/5/12/chartex" xmlns:cx7="http://schemas.microsoft.com/office/drawing/2016/5/13/chartex" xmlns:cx8="http://schemas.microsoft.com/office/drawing/2016/5/14/chartex" xmlns:mc="http://schemas.openxmlformats.org/markup-compatibility/2006" xmlns:aink="http://schemas.microsoft.com/office/drawing/2016/ink" xmlns:am3d="http://schemas.microsoft.com/office/drawing/2017/model3d" xmlns:o="urn:schemas-microsoft-com:office:office" xmlns:r="http://schemas.openxmlformats.org/officeDocument/2006/relationships" xmlns:m="http://schemas.openxmlformats.org/officeDocument/2006/math" xmlns:v="urn:schemas-microsoft-com:vml" xmlns:wp14="http://schemas.microsoft.com/office/word/2010/wordprocessingDrawing" xmlns:wp="http://schemas.openxmlformats.org/drawingml/2006/wordprocessingDrawing" xmlns:w10="urn:schemas-microsoft-com:office:word" xmlns:w="http://schemas.openxmlformats.org/wordprocessingml/2006/main" xmlns:w14="http://schemas.microsoft.com/office/word/2010/wordml" xmlns:w15="http://schemas.microsoft.com/office/word/2012/wordml" xmlns:w16cex="http://schemas.microsoft.com/office/word/2018/wordml/cex" xmlns:w16cid="http://schemas.microsoft.com/office/word/2016/wordml/cid" xmlns:w16="http://schemas.microsoft.com/office/word/2018/wordml" xmlns:w16sdtdh="http://schemas.microsoft.com/office/word/2020/wordml/sdtdatahash" xmlns:w16se="http://schemas.microsoft.com/office/word/2015/wordml/symex" xmlns:wpg="http://schemas.microsoft.com/office/word/2010/wordprocessingGroup" xmlns:wpi="http://schemas.microsoft.com/office/word/2010/wordprocessingInk" xmlns:wne="http://schemas.microsoft.com/office/word/2006/wordml" xmlns:wps="http://schemas.microsoft.com/office/word/2010/wordprocessingShape" mc:Ignorable="w14 w15 w16se w16cid w16 w16cex w16sdtdh wp14">
   <w:abstractNum w:abstractNumId="0" w15:restartNumberingAfterBreak="0">
     <w:nsid w:val="02FE685A"/>
     <w:multiLevelType w:val="hybridMultilevel"/>
@@ -5531,50 +5932,50 @@
       </w:pPr>
     </w:lvl>
   </w:abstractNum>
-  <w:num w:numId="1" w16cid:durableId="368459933">
+  <w:num w:numId="1">
     <w:abstractNumId w:val="11"/>
   </w:num>
-  <w:num w:numId="2" w16cid:durableId="1588035156">
+  <w:num w:numId="2">
     <w:abstractNumId w:val="6"/>
   </w:num>
-  <w:num w:numId="3" w16cid:durableId="523591165">
+  <w:num w:numId="3">
     <w:abstractNumId w:val="0"/>
   </w:num>
-  <w:num w:numId="4" w16cid:durableId="1765224450">
+  <w:num w:numId="4">
     <w:abstractNumId w:val="9"/>
   </w:num>
-  <w:num w:numId="5" w16cid:durableId="2087536512">
+  <w:num w:numId="5">
     <w:abstractNumId w:val="10"/>
   </w:num>
-  <w:num w:numId="6" w16cid:durableId="1494951414">
+  <w:num w:numId="6">
     <w:abstractNumId w:val="8"/>
   </w:num>
-  <w:num w:numId="7" w16cid:durableId="647712960">
+  <w:num w:numId="7">
     <w:abstractNumId w:val="3"/>
   </w:num>
-  <w:num w:numId="8" w16cid:durableId="1110785057">
+  <w:num w:numId="8">
     <w:abstractNumId w:val="7"/>
   </w:num>
-  <w:num w:numId="9" w16cid:durableId="1697266150">
+  <w:num w:numId="9">
     <w:abstractNumId w:val="1"/>
   </w:num>
-  <w:num w:numId="10" w16cid:durableId="894051089">
+  <w:num w:numId="10">
     <w:abstractNumId w:val="12"/>
   </w:num>
-  <w:num w:numId="11" w16cid:durableId="718479196">
+  <w:num w:numId="11">
     <w:abstractNumId w:val="2"/>
   </w:num>
-  <w:num w:numId="12" w16cid:durableId="582373289">
+  <w:num w:numId="12">
     <w:abstractNumId w:val="5"/>
   </w:num>
-  <w:num w:numId="13" w16cid:durableId="426191562">
+  <w:num w:numId="13">
     <w:abstractNumId w:val="4"/>
   </w:num>
 </w:numbering>
 </file>
 
 <file path=word/styles.xml><?xml version="1.0" encoding="utf-8"?>
-<w:styles xmlns:mc="http://schemas.openxmlformats.org/markup-compatibility/2006" xmlns:r="http://schemas.openxmlformats.org/officeDocument/2006/relationships" xmlns:w="http://schemas.openxmlformats.org/wordprocessingml/2006/main" xmlns:w14="http://schemas.microsoft.com/office/word/2010/wordml" xmlns:w15="http://schemas.microsoft.com/office/word/2012/wordml" xmlns:w16cex="http://schemas.microsoft.com/office/word/2018/wordml/cex" xmlns:w16cid="http://schemas.microsoft.com/office/word/2016/wordml/cid" xmlns:w16="http://schemas.microsoft.com/office/word/2018/wordml" xmlns:w16du="http://schemas.microsoft.com/office/word/2023/wordml/word16du" xmlns:w16sdtdh="http://schemas.microsoft.com/office/word/2020/wordml/sdtdatahash" xmlns:w16sdtfl="http://schemas.microsoft.com/office/word/2024/wordml/sdtformatlock" xmlns:w16se="http://schemas.microsoft.com/office/word/2015/wordml/symex" mc:Ignorable="w14 w15 w16se w16cid w16 w16cex w16sdtdh w16sdtfl w16du">
+<w:styles xmlns:mc="http://schemas.openxmlformats.org/markup-compatibility/2006" xmlns:r="http://schemas.openxmlformats.org/officeDocument/2006/relationships" xmlns:w="http://schemas.openxmlformats.org/wordprocessingml/2006/main" xmlns:w14="http://schemas.microsoft.com/office/word/2010/wordml" xmlns:w15="http://schemas.microsoft.com/office/word/2012/wordml" xmlns:w16cex="http://schemas.microsoft.com/office/word/2018/wordml/cex" xmlns:w16cid="http://schemas.microsoft.com/office/word/2016/wordml/cid" xmlns:w16="http://schemas.microsoft.com/office/word/2018/wordml" xmlns:w16sdtdh="http://schemas.microsoft.com/office/word/2020/wordml/sdtdatahash" xmlns:w16se="http://schemas.microsoft.com/office/word/2015/wordml/symex" mc:Ignorable="w14 w15 w16se w16cid w16 w16cex w16sdtdh">
   <w:docDefaults>
     <w:rPrDefault>
       <w:rPr>
@@ -5968,7 +6369,7 @@
     <w:lsdException w:name="Unresolved Mention" w:semiHidden="1" w:unhideWhenUsed="1"/>
     <w:lsdException w:name="Smart Link" w:semiHidden="1" w:unhideWhenUsed="1"/>
   </w:latentStyles>
-  <w:style w:type="paragraph" w:default="1" w:styleId="Normal">
+  <w:style w:type="paragraph" w:default="1" w:styleId="a">
     <w:name w:val="Normal"/>
     <w:qFormat/>
     <w:rsid w:val="00882D71"/>
@@ -5976,13 +6377,13 @@
       <w:spacing w:after="160" w:line="259" w:lineRule="auto"/>
     </w:pPr>
   </w:style>
-  <w:style w:type="character" w:default="1" w:styleId="DefaultParagraphFont">
+  <w:style w:type="character" w:default="1" w:styleId="a0">
     <w:name w:val="Default Paragraph Font"/>
     <w:uiPriority w:val="1"/>
     <w:semiHidden/>
     <w:unhideWhenUsed/>
   </w:style>
-  <w:style w:type="table" w:default="1" w:styleId="TableNormal">
+  <w:style w:type="table" w:default="1" w:styleId="a1">
     <w:name w:val="Normal Table"/>
     <w:uiPriority w:val="99"/>
     <w:semiHidden/>
@@ -5997,15 +6398,15 @@
       </w:tblCellMar>
     </w:tblPr>
   </w:style>
-  <w:style w:type="numbering" w:default="1" w:styleId="NoList">
+  <w:style w:type="numbering" w:default="1" w:styleId="a2">
     <w:name w:val="No List"/>
     <w:uiPriority w:val="99"/>
     <w:semiHidden/>
     <w:unhideWhenUsed/>
   </w:style>
-  <w:style w:type="paragraph" w:styleId="ListParagraph">
+  <w:style w:type="paragraph" w:styleId="a3">
     <w:name w:val="List Paragraph"/>
-    <w:basedOn w:val="Normal"/>
+    <w:basedOn w:val="a"/>
     <w:uiPriority w:val="34"/>
     <w:qFormat/>
     <w:rsid w:val="00937925"/>
@@ -6014,10 +6415,10 @@
       <w:contextualSpacing/>
     </w:pPr>
   </w:style>
-  <w:style w:type="paragraph" w:styleId="BalloonText">
+  <w:style w:type="paragraph" w:styleId="a4">
     <w:name w:val="Balloon Text"/>
-    <w:basedOn w:val="Normal"/>
-    <w:link w:val="BalloonTextChar"/>
+    <w:basedOn w:val="a"/>
+    <w:link w:val="a5"/>
     <w:uiPriority w:val="99"/>
     <w:semiHidden/>
     <w:unhideWhenUsed/>
@@ -6031,10 +6432,10 @@
       <w:szCs w:val="16"/>
     </w:rPr>
   </w:style>
-  <w:style w:type="character" w:customStyle="1" w:styleId="BalloonTextChar">
-    <w:name w:val="Balloon Text Char"/>
-    <w:basedOn w:val="DefaultParagraphFont"/>
-    <w:link w:val="BalloonText"/>
+  <w:style w:type="character" w:customStyle="1" w:styleId="a5">
+    <w:name w:val="Текст выноски Знак"/>
+    <w:basedOn w:val="a0"/>
+    <w:link w:val="a4"/>
     <w:uiPriority w:val="99"/>
     <w:semiHidden/>
     <w:rsid w:val="00D674A9"/>
@@ -6044,9 +6445,9 @@
       <w:szCs w:val="16"/>
     </w:rPr>
   </w:style>
-  <w:style w:type="table" w:styleId="TableGrid">
+  <w:style w:type="table" w:styleId="a6">
     <w:name w:val="Table Grid"/>
-    <w:basedOn w:val="TableNormal"/>
+    <w:basedOn w:val="a1"/>
     <w:uiPriority w:val="59"/>
     <w:rsid w:val="00F530B5"/>
     <w:pPr>
@@ -6062,6 +6463,74 @@
         <w:insideV w:val="single" w:sz="4" w:space="0" w:color="auto"/>
       </w:tblBorders>
     </w:tblPr>
+  </w:style>
+  <w:style w:type="character" w:styleId="a7">
+    <w:name w:val="annotation reference"/>
+    <w:basedOn w:val="a0"/>
+    <w:uiPriority w:val="99"/>
+    <w:semiHidden/>
+    <w:unhideWhenUsed/>
+    <w:rsid w:val="00B435F7"/>
+    <w:rPr>
+      <w:sz w:val="16"/>
+      <w:szCs w:val="16"/>
+    </w:rPr>
+  </w:style>
+  <w:style w:type="paragraph" w:styleId="a8">
+    <w:name w:val="annotation text"/>
+    <w:basedOn w:val="a"/>
+    <w:link w:val="a9"/>
+    <w:uiPriority w:val="99"/>
+    <w:semiHidden/>
+    <w:unhideWhenUsed/>
+    <w:rsid w:val="00B435F7"/>
+    <w:pPr>
+      <w:spacing w:line="240" w:lineRule="auto"/>
+    </w:pPr>
+    <w:rPr>
+      <w:sz w:val="20"/>
+      <w:szCs w:val="20"/>
+    </w:rPr>
+  </w:style>
+  <w:style w:type="character" w:customStyle="1" w:styleId="a9">
+    <w:name w:val="Текст примечания Знак"/>
+    <w:basedOn w:val="a0"/>
+    <w:link w:val="a8"/>
+    <w:uiPriority w:val="99"/>
+    <w:semiHidden/>
+    <w:rsid w:val="00B435F7"/>
+    <w:rPr>
+      <w:sz w:val="20"/>
+      <w:szCs w:val="20"/>
+    </w:rPr>
+  </w:style>
+  <w:style w:type="paragraph" w:styleId="aa">
+    <w:name w:val="annotation subject"/>
+    <w:basedOn w:val="a8"/>
+    <w:next w:val="a8"/>
+    <w:link w:val="ab"/>
+    <w:uiPriority w:val="99"/>
+    <w:semiHidden/>
+    <w:unhideWhenUsed/>
+    <w:rsid w:val="00B435F7"/>
+    <w:rPr>
+      <w:b/>
+      <w:bCs/>
+    </w:rPr>
+  </w:style>
+  <w:style w:type="character" w:customStyle="1" w:styleId="ab">
+    <w:name w:val="Тема примечания Знак"/>
+    <w:basedOn w:val="a9"/>
+    <w:link w:val="aa"/>
+    <w:uiPriority w:val="99"/>
+    <w:semiHidden/>
+    <w:rsid w:val="00B435F7"/>
+    <w:rPr>
+      <w:b/>
+      <w:bCs/>
+      <w:sz w:val="20"/>
+      <w:szCs w:val="20"/>
+    </w:rPr>
   </w:style>
 </w:styles>
 </file>

</xml_diff>